<commit_message>
kestrel: book fixes: retry waveform, CEX identity, consistency nits
</commit_message>
<xml_diff>
--- a/projects/components/riscv-ip/kestrel-rv32i/docs/simplified_rv32i/SIMPLIFIED_RV32I_v0.1.docx
+++ b/projects/components/riscv-ip/kestrel-rv32i/docs/simplified_rv32i/SIMPLIFIED_RV32I_v0.1.docx
@@ -122,7 +122,7 @@
             </w:rPr>
             <w:fldChar w:fldCharType="separate"/>
           </w:r>
-          <w:hyperlink w:anchor="__RefHeading___Toc11478_1805670434">
+          <w:hyperlink w:anchor="__RefHeading___Toc11506_3742996938">
             <w:r>
               <w:rPr>
                 <w:webHidden/>
@@ -143,7 +143,7 @@
             </w:tabs>
             <w:rPr/>
           </w:pPr>
-          <w:hyperlink w:anchor="__RefHeading___Toc11480_1805670434">
+          <w:hyperlink w:anchor="__RefHeading___Toc11508_3742996938">
             <w:r>
               <w:rPr>
                 <w:webHidden/>
@@ -164,7 +164,7 @@
             </w:tabs>
             <w:rPr/>
           </w:pPr>
-          <w:hyperlink w:anchor="__RefHeading___Toc11482_1805670434">
+          <w:hyperlink w:anchor="__RefHeading___Toc11510_3742996938">
             <w:r>
               <w:rPr>
                 <w:webHidden/>
@@ -185,7 +185,7 @@
             </w:tabs>
             <w:rPr/>
           </w:pPr>
-          <w:hyperlink w:anchor="__RefHeading___Toc11484_1805670434">
+          <w:hyperlink w:anchor="__RefHeading___Toc11512_3742996938">
             <w:r>
               <w:rPr>
                 <w:webHidden/>
@@ -206,7 +206,7 @@
             </w:tabs>
             <w:rPr/>
           </w:pPr>
-          <w:hyperlink w:anchor="__RefHeading___Toc11486_1805670434">
+          <w:hyperlink w:anchor="__RefHeading___Toc11514_3742996938">
             <w:r>
               <w:rPr>
                 <w:webHidden/>
@@ -227,7 +227,7 @@
             </w:tabs>
             <w:rPr/>
           </w:pPr>
-          <w:hyperlink w:anchor="__RefHeading___Toc11488_1805670434">
+          <w:hyperlink w:anchor="__RefHeading___Toc11516_3742996938">
             <w:r>
               <w:rPr>
                 <w:webHidden/>
@@ -248,7 +248,7 @@
             </w:tabs>
             <w:rPr/>
           </w:pPr>
-          <w:hyperlink w:anchor="__RefHeading___Toc11490_1805670434">
+          <w:hyperlink w:anchor="__RefHeading___Toc11518_3742996938">
             <w:r>
               <w:rPr>
                 <w:webHidden/>
@@ -269,7 +269,7 @@
             </w:tabs>
             <w:rPr/>
           </w:pPr>
-          <w:hyperlink w:anchor="__RefHeading___Toc11492_1805670434">
+          <w:hyperlink w:anchor="__RefHeading___Toc11520_3742996938">
             <w:r>
               <w:rPr>
                 <w:webHidden/>
@@ -290,7 +290,7 @@
             </w:tabs>
             <w:rPr/>
           </w:pPr>
-          <w:hyperlink w:anchor="__RefHeading___Toc11494_1805670434">
+          <w:hyperlink w:anchor="__RefHeading___Toc11522_3742996938">
             <w:r>
               <w:rPr>
                 <w:webHidden/>
@@ -311,7 +311,7 @@
             </w:tabs>
             <w:rPr/>
           </w:pPr>
-          <w:hyperlink w:anchor="__RefHeading___Toc11496_1805670434">
+          <w:hyperlink w:anchor="__RefHeading___Toc11524_3742996938">
             <w:r>
               <w:rPr>
                 <w:webHidden/>
@@ -332,7 +332,7 @@
             </w:tabs>
             <w:rPr/>
           </w:pPr>
-          <w:hyperlink w:anchor="__RefHeading___Toc11498_1805670434">
+          <w:hyperlink w:anchor="__RefHeading___Toc11526_3742996938">
             <w:r>
               <w:rPr>
                 <w:webHidden/>
@@ -353,7 +353,7 @@
             </w:tabs>
             <w:rPr/>
           </w:pPr>
-          <w:hyperlink w:anchor="__RefHeading___Toc11500_1805670434">
+          <w:hyperlink w:anchor="__RefHeading___Toc11528_3742996938">
             <w:r>
               <w:rPr>
                 <w:webHidden/>
@@ -374,7 +374,7 @@
             </w:tabs>
             <w:rPr/>
           </w:pPr>
-          <w:hyperlink w:anchor="__RefHeading___Toc11502_1805670434">
+          <w:hyperlink w:anchor="__RefHeading___Toc11530_3742996938">
             <w:r>
               <w:rPr>
                 <w:webHidden/>
@@ -395,7 +395,7 @@
             </w:tabs>
             <w:rPr/>
           </w:pPr>
-          <w:hyperlink w:anchor="__RefHeading___Toc11504_1805670434">
+          <w:hyperlink w:anchor="__RefHeading___Toc11532_3742996938">
             <w:r>
               <w:rPr>
                 <w:webHidden/>
@@ -416,7 +416,7 @@
             </w:tabs>
             <w:rPr/>
           </w:pPr>
-          <w:hyperlink w:anchor="__RefHeading___Toc11506_1805670434">
+          <w:hyperlink w:anchor="__RefHeading___Toc11534_3742996938">
             <w:r>
               <w:rPr>
                 <w:webHidden/>
@@ -437,7 +437,7 @@
             </w:tabs>
             <w:rPr/>
           </w:pPr>
-          <w:hyperlink w:anchor="__RefHeading___Toc11508_1805670434">
+          <w:hyperlink w:anchor="__RefHeading___Toc11536_3742996938">
             <w:r>
               <w:rPr>
                 <w:webHidden/>
@@ -458,7 +458,7 @@
             </w:tabs>
             <w:rPr/>
           </w:pPr>
-          <w:hyperlink w:anchor="__RefHeading___Toc11510_1805670434">
+          <w:hyperlink w:anchor="__RefHeading___Toc11538_3742996938">
             <w:r>
               <w:rPr>
                 <w:webHidden/>
@@ -479,7 +479,7 @@
             </w:tabs>
             <w:rPr/>
           </w:pPr>
-          <w:hyperlink w:anchor="__RefHeading___Toc11512_1805670434">
+          <w:hyperlink w:anchor="__RefHeading___Toc11540_3742996938">
             <w:r>
               <w:rPr>
                 <w:webHidden/>
@@ -500,7 +500,7 @@
             </w:tabs>
             <w:rPr/>
           </w:pPr>
-          <w:hyperlink w:anchor="__RefHeading___Toc11514_1805670434">
+          <w:hyperlink w:anchor="__RefHeading___Toc11542_3742996938">
             <w:r>
               <w:rPr>
                 <w:webHidden/>
@@ -521,7 +521,7 @@
             </w:tabs>
             <w:rPr/>
           </w:pPr>
-          <w:hyperlink w:anchor="__RefHeading___Toc11516_1805670434">
+          <w:hyperlink w:anchor="__RefHeading___Toc11544_3742996938">
             <w:r>
               <w:rPr>
                 <w:webHidden/>
@@ -542,7 +542,7 @@
             </w:tabs>
             <w:rPr/>
           </w:pPr>
-          <w:hyperlink w:anchor="__RefHeading___Toc11518_1805670434">
+          <w:hyperlink w:anchor="__RefHeading___Toc11546_3742996938">
             <w:r>
               <w:rPr>
                 <w:webHidden/>
@@ -563,7 +563,7 @@
             </w:tabs>
             <w:rPr/>
           </w:pPr>
-          <w:hyperlink w:anchor="__RefHeading___Toc11520_1805670434">
+          <w:hyperlink w:anchor="__RefHeading___Toc11548_3742996938">
             <w:r>
               <w:rPr>
                 <w:webHidden/>
@@ -584,7 +584,7 @@
             </w:tabs>
             <w:rPr/>
           </w:pPr>
-          <w:hyperlink w:anchor="__RefHeading___Toc11522_1805670434">
+          <w:hyperlink w:anchor="__RefHeading___Toc11550_3742996938">
             <w:r>
               <w:rPr>
                 <w:webHidden/>
@@ -605,7 +605,7 @@
             </w:tabs>
             <w:rPr/>
           </w:pPr>
-          <w:hyperlink w:anchor="__RefHeading___Toc11524_1805670434">
+          <w:hyperlink w:anchor="__RefHeading___Toc11552_3742996938">
             <w:r>
               <w:rPr>
                 <w:webHidden/>
@@ -626,7 +626,7 @@
             </w:tabs>
             <w:rPr/>
           </w:pPr>
-          <w:hyperlink w:anchor="__RefHeading___Toc11526_1805670434">
+          <w:hyperlink w:anchor="__RefHeading___Toc11554_3742996938">
             <w:r>
               <w:rPr>
                 <w:webHidden/>
@@ -647,7 +647,7 @@
             </w:tabs>
             <w:rPr/>
           </w:pPr>
-          <w:hyperlink w:anchor="__RefHeading___Toc11528_1805670434">
+          <w:hyperlink w:anchor="__RefHeading___Toc11556_3742996938">
             <w:r>
               <w:rPr>
                 <w:webHidden/>
@@ -668,7 +668,7 @@
             </w:tabs>
             <w:rPr/>
           </w:pPr>
-          <w:hyperlink w:anchor="__RefHeading___Toc11530_1805670434">
+          <w:hyperlink w:anchor="__RefHeading___Toc11558_3742996938">
             <w:r>
               <w:rPr>
                 <w:webHidden/>
@@ -689,7 +689,7 @@
             </w:tabs>
             <w:rPr/>
           </w:pPr>
-          <w:hyperlink w:anchor="__RefHeading___Toc11532_1805670434">
+          <w:hyperlink w:anchor="__RefHeading___Toc11560_3742996938">
             <w:r>
               <w:rPr>
                 <w:webHidden/>
@@ -710,7 +710,7 @@
             </w:tabs>
             <w:rPr/>
           </w:pPr>
-          <w:hyperlink w:anchor="__RefHeading___Toc11534_1805670434">
+          <w:hyperlink w:anchor="__RefHeading___Toc11562_3742996938">
             <w:r>
               <w:rPr>
                 <w:webHidden/>
@@ -731,7 +731,7 @@
             </w:tabs>
             <w:rPr/>
           </w:pPr>
-          <w:hyperlink w:anchor="__RefHeading___Toc11536_1805670434">
+          <w:hyperlink w:anchor="__RefHeading___Toc11564_3742996938">
             <w:r>
               <w:rPr>
                 <w:webHidden/>
@@ -752,7 +752,7 @@
             </w:tabs>
             <w:rPr/>
           </w:pPr>
-          <w:hyperlink w:anchor="__RefHeading___Toc11538_1805670434">
+          <w:hyperlink w:anchor="__RefHeading___Toc11566_3742996938">
             <w:r>
               <w:rPr>
                 <w:webHidden/>
@@ -773,7 +773,7 @@
             </w:tabs>
             <w:rPr/>
           </w:pPr>
-          <w:hyperlink w:anchor="__RefHeading___Toc11540_1805670434">
+          <w:hyperlink w:anchor="__RefHeading___Toc11568_3742996938">
             <w:r>
               <w:rPr>
                 <w:webHidden/>
@@ -794,7 +794,7 @@
             </w:tabs>
             <w:rPr/>
           </w:pPr>
-          <w:hyperlink w:anchor="__RefHeading___Toc11542_1805670434">
+          <w:hyperlink w:anchor="__RefHeading___Toc11570_3742996938">
             <w:r>
               <w:rPr>
                 <w:webHidden/>
@@ -815,7 +815,7 @@
             </w:tabs>
             <w:rPr/>
           </w:pPr>
-          <w:hyperlink w:anchor="__RefHeading___Toc11544_1805670434">
+          <w:hyperlink w:anchor="__RefHeading___Toc11572_3742996938">
             <w:r>
               <w:rPr>
                 <w:webHidden/>
@@ -836,7 +836,7 @@
             </w:tabs>
             <w:rPr/>
           </w:pPr>
-          <w:hyperlink w:anchor="__RefHeading___Toc11546_1805670434">
+          <w:hyperlink w:anchor="__RefHeading___Toc11574_3742996938">
             <w:r>
               <w:rPr>
                 <w:webHidden/>
@@ -857,7 +857,7 @@
             </w:tabs>
             <w:rPr/>
           </w:pPr>
-          <w:hyperlink w:anchor="__RefHeading___Toc11548_1805670434">
+          <w:hyperlink w:anchor="__RefHeading___Toc11576_3742996938">
             <w:r>
               <w:rPr>
                 <w:webHidden/>
@@ -878,7 +878,7 @@
             </w:tabs>
             <w:rPr/>
           </w:pPr>
-          <w:hyperlink w:anchor="__RefHeading___Toc11550_1805670434">
+          <w:hyperlink w:anchor="__RefHeading___Toc11578_3742996938">
             <w:r>
               <w:rPr>
                 <w:webHidden/>
@@ -899,7 +899,7 @@
             </w:tabs>
             <w:rPr/>
           </w:pPr>
-          <w:hyperlink w:anchor="__RefHeading___Toc11552_1805670434">
+          <w:hyperlink w:anchor="__RefHeading___Toc11580_3742996938">
             <w:r>
               <w:rPr>
                 <w:webHidden/>
@@ -920,7 +920,7 @@
             </w:tabs>
             <w:rPr/>
           </w:pPr>
-          <w:hyperlink w:anchor="__RefHeading___Toc11554_1805670434">
+          <w:hyperlink w:anchor="__RefHeading___Toc11582_3742996938">
             <w:r>
               <w:rPr>
                 <w:webHidden/>
@@ -941,7 +941,7 @@
             </w:tabs>
             <w:rPr/>
           </w:pPr>
-          <w:hyperlink w:anchor="__RefHeading___Toc11556_1805670434">
+          <w:hyperlink w:anchor="__RefHeading___Toc11584_3742996938">
             <w:r>
               <w:rPr>
                 <w:webHidden/>
@@ -962,7 +962,7 @@
             </w:tabs>
             <w:rPr/>
           </w:pPr>
-          <w:hyperlink w:anchor="__RefHeading___Toc11558_1805670434">
+          <w:hyperlink w:anchor="__RefHeading___Toc11586_3742996938">
             <w:r>
               <w:rPr>
                 <w:webHidden/>
@@ -983,7 +983,7 @@
             </w:tabs>
             <w:rPr/>
           </w:pPr>
-          <w:hyperlink w:anchor="__RefHeading___Toc11560_1805670434">
+          <w:hyperlink w:anchor="__RefHeading___Toc11588_3742996938">
             <w:r>
               <w:rPr>
                 <w:webHidden/>
@@ -1004,7 +1004,7 @@
             </w:tabs>
             <w:rPr/>
           </w:pPr>
-          <w:hyperlink w:anchor="__RefHeading___Toc11562_1805670434">
+          <w:hyperlink w:anchor="__RefHeading___Toc11590_3742996938">
             <w:r>
               <w:rPr>
                 <w:webHidden/>
@@ -1025,7 +1025,7 @@
             </w:tabs>
             <w:rPr/>
           </w:pPr>
-          <w:hyperlink w:anchor="__RefHeading___Toc11564_1805670434">
+          <w:hyperlink w:anchor="__RefHeading___Toc11592_3742996938">
             <w:r>
               <w:rPr>
                 <w:webHidden/>
@@ -1046,7 +1046,7 @@
             </w:tabs>
             <w:rPr/>
           </w:pPr>
-          <w:hyperlink w:anchor="__RefHeading___Toc11566_1805670434">
+          <w:hyperlink w:anchor="__RefHeading___Toc11594_3742996938">
             <w:r>
               <w:rPr>
                 <w:webHidden/>
@@ -1067,7 +1067,7 @@
             </w:tabs>
             <w:rPr/>
           </w:pPr>
-          <w:hyperlink w:anchor="__RefHeading___Toc11568_1805670434">
+          <w:hyperlink w:anchor="__RefHeading___Toc11596_3742996938">
             <w:r>
               <w:rPr>
                 <w:webHidden/>
@@ -1088,7 +1088,7 @@
             </w:tabs>
             <w:rPr/>
           </w:pPr>
-          <w:hyperlink w:anchor="__RefHeading___Toc11570_1805670434">
+          <w:hyperlink w:anchor="__RefHeading___Toc11598_3742996938">
             <w:r>
               <w:rPr>
                 <w:webHidden/>
@@ -1109,7 +1109,7 @@
             </w:tabs>
             <w:rPr/>
           </w:pPr>
-          <w:hyperlink w:anchor="__RefHeading___Toc11572_1805670434">
+          <w:hyperlink w:anchor="__RefHeading___Toc11600_3742996938">
             <w:r>
               <w:rPr>
                 <w:webHidden/>
@@ -1130,7 +1130,7 @@
             </w:tabs>
             <w:rPr/>
           </w:pPr>
-          <w:hyperlink w:anchor="__RefHeading___Toc11574_1805670434">
+          <w:hyperlink w:anchor="__RefHeading___Toc11602_3742996938">
             <w:r>
               <w:rPr>
                 <w:webHidden/>
@@ -1151,7 +1151,7 @@
             </w:tabs>
             <w:rPr/>
           </w:pPr>
-          <w:hyperlink w:anchor="__RefHeading___Toc11576_1805670434">
+          <w:hyperlink w:anchor="__RefHeading___Toc11604_3742996938">
             <w:r>
               <w:rPr>
                 <w:webHidden/>
@@ -1172,7 +1172,7 @@
             </w:tabs>
             <w:rPr/>
           </w:pPr>
-          <w:hyperlink w:anchor="__RefHeading___Toc11578_1805670434">
+          <w:hyperlink w:anchor="__RefHeading___Toc11606_3742996938">
             <w:r>
               <w:rPr>
                 <w:webHidden/>
@@ -1193,7 +1193,7 @@
             </w:tabs>
             <w:rPr/>
           </w:pPr>
-          <w:hyperlink w:anchor="__RefHeading___Toc11580_1805670434">
+          <w:hyperlink w:anchor="__RefHeading___Toc11608_3742996938">
             <w:r>
               <w:rPr>
                 <w:webHidden/>
@@ -1214,7 +1214,7 @@
             </w:tabs>
             <w:rPr/>
           </w:pPr>
-          <w:hyperlink w:anchor="__RefHeading___Toc11582_1805670434">
+          <w:hyperlink w:anchor="__RefHeading___Toc11610_3742996938">
             <w:r>
               <w:rPr>
                 <w:webHidden/>
@@ -1235,7 +1235,7 @@
             </w:tabs>
             <w:rPr/>
           </w:pPr>
-          <w:hyperlink w:anchor="__RefHeading___Toc11584_1805670434">
+          <w:hyperlink w:anchor="__RefHeading___Toc11612_3742996938">
             <w:r>
               <w:rPr>
                 <w:webHidden/>
@@ -1256,7 +1256,7 @@
             </w:tabs>
             <w:rPr/>
           </w:pPr>
-          <w:hyperlink w:anchor="__RefHeading___Toc11586_1805670434">
+          <w:hyperlink w:anchor="__RefHeading___Toc11614_3742996938">
             <w:r>
               <w:rPr>
                 <w:webHidden/>
@@ -1277,7 +1277,7 @@
             </w:tabs>
             <w:rPr/>
           </w:pPr>
-          <w:hyperlink w:anchor="__RefHeading___Toc11588_1805670434">
+          <w:hyperlink w:anchor="__RefHeading___Toc11616_3742996938">
             <w:r>
               <w:rPr>
                 <w:webHidden/>
@@ -1298,7 +1298,7 @@
             </w:tabs>
             <w:rPr/>
           </w:pPr>
-          <w:hyperlink w:anchor="__RefHeading___Toc11590_1805670434">
+          <w:hyperlink w:anchor="__RefHeading___Toc11618_3742996938">
             <w:r>
               <w:rPr>
                 <w:webHidden/>
@@ -1319,7 +1319,7 @@
             </w:tabs>
             <w:rPr/>
           </w:pPr>
-          <w:hyperlink w:anchor="__RefHeading___Toc11592_1805670434">
+          <w:hyperlink w:anchor="__RefHeading___Toc11620_3742996938">
             <w:r>
               <w:rPr>
                 <w:webHidden/>
@@ -1340,7 +1340,7 @@
             </w:tabs>
             <w:rPr/>
           </w:pPr>
-          <w:hyperlink w:anchor="__RefHeading___Toc11594_1805670434">
+          <w:hyperlink w:anchor="__RefHeading___Toc11622_3742996938">
             <w:r>
               <w:rPr>
                 <w:webHidden/>
@@ -1361,7 +1361,7 @@
             </w:tabs>
             <w:rPr/>
           </w:pPr>
-          <w:hyperlink w:anchor="__RefHeading___Toc11596_1805670434">
+          <w:hyperlink w:anchor="__RefHeading___Toc11624_3742996938">
             <w:r>
               <w:rPr>
                 <w:webHidden/>
@@ -1382,7 +1382,7 @@
             </w:tabs>
             <w:rPr/>
           </w:pPr>
-          <w:hyperlink w:anchor="__RefHeading___Toc11598_1805670434">
+          <w:hyperlink w:anchor="__RefHeading___Toc11626_3742996938">
             <w:r>
               <w:rPr>
                 <w:webHidden/>
@@ -1403,7 +1403,7 @@
             </w:tabs>
             <w:rPr/>
           </w:pPr>
-          <w:hyperlink w:anchor="__RefHeading___Toc11600_1805670434">
+          <w:hyperlink w:anchor="__RefHeading___Toc11628_3742996938">
             <w:r>
               <w:rPr>
                 <w:webHidden/>
@@ -1424,7 +1424,7 @@
             </w:tabs>
             <w:rPr/>
           </w:pPr>
-          <w:hyperlink w:anchor="__RefHeading___Toc11602_1805670434">
+          <w:hyperlink w:anchor="__RefHeading___Toc11630_3742996938">
             <w:r>
               <w:rPr>
                 <w:webHidden/>
@@ -1445,7 +1445,7 @@
             </w:tabs>
             <w:rPr/>
           </w:pPr>
-          <w:hyperlink w:anchor="__RefHeading___Toc11604_1805670434">
+          <w:hyperlink w:anchor="__RefHeading___Toc11632_3742996938">
             <w:r>
               <w:rPr>
                 <w:webHidden/>
@@ -1466,7 +1466,7 @@
             </w:tabs>
             <w:rPr/>
           </w:pPr>
-          <w:hyperlink w:anchor="__RefHeading___Toc11606_1805670434">
+          <w:hyperlink w:anchor="__RefHeading___Toc11634_3742996938">
             <w:r>
               <w:rPr>
                 <w:webHidden/>
@@ -1487,7 +1487,7 @@
             </w:tabs>
             <w:rPr/>
           </w:pPr>
-          <w:hyperlink w:anchor="__RefHeading___Toc11608_1805670434">
+          <w:hyperlink w:anchor="__RefHeading___Toc11636_3742996938">
             <w:r>
               <w:rPr>
                 <w:webHidden/>
@@ -1508,7 +1508,7 @@
             </w:tabs>
             <w:rPr/>
           </w:pPr>
-          <w:hyperlink w:anchor="__RefHeading___Toc11610_1805670434">
+          <w:hyperlink w:anchor="__RefHeading___Toc11638_3742996938">
             <w:r>
               <w:rPr>
                 <w:webHidden/>
@@ -1529,7 +1529,7 @@
             </w:tabs>
             <w:rPr/>
           </w:pPr>
-          <w:hyperlink w:anchor="__RefHeading___Toc11612_1805670434">
+          <w:hyperlink w:anchor="__RefHeading___Toc11640_3742996938">
             <w:r>
               <w:rPr>
                 <w:webHidden/>
@@ -1550,7 +1550,7 @@
             </w:tabs>
             <w:rPr/>
           </w:pPr>
-          <w:hyperlink w:anchor="__RefHeading___Toc11614_1805670434">
+          <w:hyperlink w:anchor="__RefHeading___Toc11642_3742996938">
             <w:r>
               <w:rPr>
                 <w:webHidden/>
@@ -1571,7 +1571,7 @@
             </w:tabs>
             <w:rPr/>
           </w:pPr>
-          <w:hyperlink w:anchor="__RefHeading___Toc11616_1805670434">
+          <w:hyperlink w:anchor="__RefHeading___Toc11644_3742996938">
             <w:r>
               <w:rPr>
                 <w:webHidden/>
@@ -1592,7 +1592,7 @@
             </w:tabs>
             <w:rPr/>
           </w:pPr>
-          <w:hyperlink w:anchor="__RefHeading___Toc11618_1805670434">
+          <w:hyperlink w:anchor="__RefHeading___Toc11646_3742996938">
             <w:r>
               <w:rPr>
                 <w:webHidden/>
@@ -1613,7 +1613,7 @@
             </w:tabs>
             <w:rPr/>
           </w:pPr>
-          <w:hyperlink w:anchor="__RefHeading___Toc11620_1805670434">
+          <w:hyperlink w:anchor="__RefHeading___Toc11648_3742996938">
             <w:r>
               <w:rPr>
                 <w:webHidden/>
@@ -1634,7 +1634,7 @@
             </w:tabs>
             <w:rPr/>
           </w:pPr>
-          <w:hyperlink w:anchor="__RefHeading___Toc11622_1805670434">
+          <w:hyperlink w:anchor="__RefHeading___Toc11650_3742996938">
             <w:r>
               <w:rPr>
                 <w:webHidden/>
@@ -1655,7 +1655,7 @@
             </w:tabs>
             <w:rPr/>
           </w:pPr>
-          <w:hyperlink w:anchor="__RefHeading___Toc11624_1805670434">
+          <w:hyperlink w:anchor="__RefHeading___Toc11652_3742996938">
             <w:r>
               <w:rPr>
                 <w:webHidden/>
@@ -1676,7 +1676,7 @@
             </w:tabs>
             <w:rPr/>
           </w:pPr>
-          <w:hyperlink w:anchor="__RefHeading___Toc11626_1805670434">
+          <w:hyperlink w:anchor="__RefHeading___Toc11654_3742996938">
             <w:r>
               <w:rPr>
                 <w:webHidden/>
@@ -1697,7 +1697,7 @@
             </w:tabs>
             <w:rPr/>
           </w:pPr>
-          <w:hyperlink w:anchor="__RefHeading___Toc11628_1805670434">
+          <w:hyperlink w:anchor="__RefHeading___Toc11656_3742996938">
             <w:r>
               <w:rPr>
                 <w:webHidden/>
@@ -1718,7 +1718,7 @@
             </w:tabs>
             <w:rPr/>
           </w:pPr>
-          <w:hyperlink w:anchor="__RefHeading___Toc11630_1805670434">
+          <w:hyperlink w:anchor="__RefHeading___Toc11658_3742996938">
             <w:r>
               <w:rPr>
                 <w:webHidden/>
@@ -1739,7 +1739,7 @@
             </w:tabs>
             <w:rPr/>
           </w:pPr>
-          <w:hyperlink w:anchor="__RefHeading___Toc11632_1805670434">
+          <w:hyperlink w:anchor="__RefHeading___Toc11660_3742996938">
             <w:r>
               <w:rPr>
                 <w:webHidden/>
@@ -1760,7 +1760,7 @@
             </w:tabs>
             <w:rPr/>
           </w:pPr>
-          <w:hyperlink w:anchor="__RefHeading___Toc11634_1805670434">
+          <w:hyperlink w:anchor="__RefHeading___Toc11662_3742996938">
             <w:r>
               <w:rPr>
                 <w:webHidden/>
@@ -1781,7 +1781,7 @@
             </w:tabs>
             <w:rPr/>
           </w:pPr>
-          <w:hyperlink w:anchor="__RefHeading___Toc11636_1805670434">
+          <w:hyperlink w:anchor="__RefHeading___Toc11664_3742996938">
             <w:r>
               <w:rPr>
                 <w:webHidden/>
@@ -1802,7 +1802,7 @@
             </w:tabs>
             <w:rPr/>
           </w:pPr>
-          <w:hyperlink w:anchor="__RefHeading___Toc11638_1805670434">
+          <w:hyperlink w:anchor="__RefHeading___Toc11666_3742996938">
             <w:r>
               <w:rPr>
                 <w:webHidden/>
@@ -1823,7 +1823,7 @@
             </w:tabs>
             <w:rPr/>
           </w:pPr>
-          <w:hyperlink w:anchor="__RefHeading___Toc11640_1805670434">
+          <w:hyperlink w:anchor="__RefHeading___Toc11668_3742996938">
             <w:r>
               <w:rPr>
                 <w:webHidden/>
@@ -1844,7 +1844,7 @@
             </w:tabs>
             <w:rPr/>
           </w:pPr>
-          <w:hyperlink w:anchor="__RefHeading___Toc11642_1805670434">
+          <w:hyperlink w:anchor="__RefHeading___Toc11670_3742996938">
             <w:r>
               <w:rPr>
                 <w:webHidden/>
@@ -1865,7 +1865,7 @@
             </w:tabs>
             <w:rPr/>
           </w:pPr>
-          <w:hyperlink w:anchor="__RefHeading___Toc11644_1805670434">
+          <w:hyperlink w:anchor="__RefHeading___Toc11672_3742996938">
             <w:r>
               <w:rPr>
                 <w:webHidden/>
@@ -1886,7 +1886,7 @@
             </w:tabs>
             <w:rPr/>
           </w:pPr>
-          <w:hyperlink w:anchor="__RefHeading___Toc11646_1805670434">
+          <w:hyperlink w:anchor="__RefHeading___Toc11674_3742996938">
             <w:r>
               <w:rPr>
                 <w:webHidden/>
@@ -1907,7 +1907,7 @@
             </w:tabs>
             <w:rPr/>
           </w:pPr>
-          <w:hyperlink w:anchor="__RefHeading___Toc11648_1805670434">
+          <w:hyperlink w:anchor="__RefHeading___Toc11676_3742996938">
             <w:r>
               <w:rPr>
                 <w:webHidden/>
@@ -1928,7 +1928,7 @@
             </w:tabs>
             <w:rPr/>
           </w:pPr>
-          <w:hyperlink w:anchor="__RefHeading___Toc11650_1805670434">
+          <w:hyperlink w:anchor="__RefHeading___Toc11678_3742996938">
             <w:r>
               <w:rPr>
                 <w:webHidden/>
@@ -1949,7 +1949,7 @@
             </w:tabs>
             <w:rPr/>
           </w:pPr>
-          <w:hyperlink w:anchor="__RefHeading___Toc11652_1805670434">
+          <w:hyperlink w:anchor="__RefHeading___Toc11680_3742996938">
             <w:r>
               <w:rPr>
                 <w:webHidden/>
@@ -1970,7 +1970,7 @@
             </w:tabs>
             <w:rPr/>
           </w:pPr>
-          <w:hyperlink w:anchor="__RefHeading___Toc11654_1805670434">
+          <w:hyperlink w:anchor="__RefHeading___Toc11682_3742996938">
             <w:r>
               <w:rPr>
                 <w:webHidden/>
@@ -1991,7 +1991,7 @@
             </w:tabs>
             <w:rPr/>
           </w:pPr>
-          <w:hyperlink w:anchor="__RefHeading___Toc11656_1805670434">
+          <w:hyperlink w:anchor="__RefHeading___Toc11684_3742996938">
             <w:r>
               <w:rPr>
                 <w:webHidden/>
@@ -2012,7 +2012,7 @@
             </w:tabs>
             <w:rPr/>
           </w:pPr>
-          <w:hyperlink w:anchor="__RefHeading___Toc11658_1805670434">
+          <w:hyperlink w:anchor="__RefHeading___Toc11686_3742996938">
             <w:r>
               <w:rPr>
                 <w:webHidden/>
@@ -2033,7 +2033,7 @@
             </w:tabs>
             <w:rPr/>
           </w:pPr>
-          <w:hyperlink w:anchor="__RefHeading___Toc11660_1805670434">
+          <w:hyperlink w:anchor="__RefHeading___Toc11688_3742996938">
             <w:r>
               <w:rPr>
                 <w:webHidden/>
@@ -2054,7 +2054,7 @@
             </w:tabs>
             <w:rPr/>
           </w:pPr>
-          <w:hyperlink w:anchor="__RefHeading___Toc11662_1805670434">
+          <w:hyperlink w:anchor="__RefHeading___Toc11690_3742996938">
             <w:r>
               <w:rPr>
                 <w:webHidden/>
@@ -2075,7 +2075,7 @@
             </w:tabs>
             <w:rPr/>
           </w:pPr>
-          <w:hyperlink w:anchor="__RefHeading___Toc11664_1805670434">
+          <w:hyperlink w:anchor="__RefHeading___Toc11692_3742996938">
             <w:r>
               <w:rPr>
                 <w:webHidden/>
@@ -2096,7 +2096,7 @@
             </w:tabs>
             <w:rPr/>
           </w:pPr>
-          <w:hyperlink w:anchor="__RefHeading___Toc11666_1805670434">
+          <w:hyperlink w:anchor="__RefHeading___Toc11694_3742996938">
             <w:r>
               <w:rPr>
                 <w:webHidden/>
@@ -2117,7 +2117,7 @@
             </w:tabs>
             <w:rPr/>
           </w:pPr>
-          <w:hyperlink w:anchor="__RefHeading___Toc11668_1805670434">
+          <w:hyperlink w:anchor="__RefHeading___Toc11696_3742996938">
             <w:r>
               <w:rPr>
                 <w:webHidden/>
@@ -2138,7 +2138,7 @@
             </w:tabs>
             <w:rPr/>
           </w:pPr>
-          <w:hyperlink w:anchor="__RefHeading___Toc11670_1805670434">
+          <w:hyperlink w:anchor="__RefHeading___Toc11698_3742996938">
             <w:r>
               <w:rPr>
                 <w:webHidden/>
@@ -2159,7 +2159,7 @@
             </w:tabs>
             <w:rPr/>
           </w:pPr>
-          <w:hyperlink w:anchor="__RefHeading___Toc11672_1805670434">
+          <w:hyperlink w:anchor="__RefHeading___Toc11700_3742996938">
             <w:r>
               <w:rPr>
                 <w:webHidden/>
@@ -2180,7 +2180,7 @@
             </w:tabs>
             <w:rPr/>
           </w:pPr>
-          <w:hyperlink w:anchor="__RefHeading___Toc11674_1805670434">
+          <w:hyperlink w:anchor="__RefHeading___Toc11702_3742996938">
             <w:r>
               <w:rPr>
                 <w:webHidden/>
@@ -2201,7 +2201,7 @@
             </w:tabs>
             <w:rPr/>
           </w:pPr>
-          <w:hyperlink w:anchor="__RefHeading___Toc11676_1805670434">
+          <w:hyperlink w:anchor="__RefHeading___Toc11704_3742996938">
             <w:r>
               <w:rPr>
                 <w:webHidden/>
@@ -2222,7 +2222,7 @@
             </w:tabs>
             <w:rPr/>
           </w:pPr>
-          <w:hyperlink w:anchor="__RefHeading___Toc11678_1805670434">
+          <w:hyperlink w:anchor="__RefHeading___Toc11706_3742996938">
             <w:r>
               <w:rPr>
                 <w:webHidden/>
@@ -2243,7 +2243,7 @@
             </w:tabs>
             <w:rPr/>
           </w:pPr>
-          <w:hyperlink w:anchor="__RefHeading___Toc11680_1805670434">
+          <w:hyperlink w:anchor="__RefHeading___Toc11708_3742996938">
             <w:r>
               <w:rPr>
                 <w:webHidden/>
@@ -2264,7 +2264,7 @@
             </w:tabs>
             <w:rPr/>
           </w:pPr>
-          <w:hyperlink w:anchor="__RefHeading___Toc11682_1805670434">
+          <w:hyperlink w:anchor="__RefHeading___Toc11710_3742996938">
             <w:r>
               <w:rPr>
                 <w:webHidden/>
@@ -2285,7 +2285,7 @@
             </w:tabs>
             <w:rPr/>
           </w:pPr>
-          <w:hyperlink w:anchor="__RefHeading___Toc11684_1805670434">
+          <w:hyperlink w:anchor="__RefHeading___Toc11712_3742996938">
             <w:r>
               <w:rPr>
                 <w:webHidden/>
@@ -2306,7 +2306,7 @@
             </w:tabs>
             <w:rPr/>
           </w:pPr>
-          <w:hyperlink w:anchor="__RefHeading___Toc11686_1805670434">
+          <w:hyperlink w:anchor="__RefHeading___Toc11714_3742996938">
             <w:r>
               <w:rPr>
                 <w:webHidden/>
@@ -2327,7 +2327,7 @@
             </w:tabs>
             <w:rPr/>
           </w:pPr>
-          <w:hyperlink w:anchor="__RefHeading___Toc11688_1805670434">
+          <w:hyperlink w:anchor="__RefHeading___Toc11716_3742996938">
             <w:r>
               <w:rPr>
                 <w:webHidden/>
@@ -2348,7 +2348,7 @@
             </w:tabs>
             <w:rPr/>
           </w:pPr>
-          <w:hyperlink w:anchor="__RefHeading___Toc11690_1805670434">
+          <w:hyperlink w:anchor="__RefHeading___Toc11718_3742996938">
             <w:r>
               <w:rPr>
                 <w:webHidden/>
@@ -2369,7 +2369,7 @@
             </w:tabs>
             <w:rPr/>
           </w:pPr>
-          <w:hyperlink w:anchor="__RefHeading___Toc11692_1805670434">
+          <w:hyperlink w:anchor="__RefHeading___Toc11720_3742996938">
             <w:r>
               <w:rPr>
                 <w:webHidden/>
@@ -2390,7 +2390,7 @@
             </w:tabs>
             <w:rPr/>
           </w:pPr>
-          <w:hyperlink w:anchor="__RefHeading___Toc11694_1805670434">
+          <w:hyperlink w:anchor="__RefHeading___Toc11722_3742996938">
             <w:r>
               <w:rPr>
                 <w:webHidden/>
@@ -2411,7 +2411,7 @@
             </w:tabs>
             <w:rPr/>
           </w:pPr>
-          <w:hyperlink w:anchor="__RefHeading___Toc11696_1805670434">
+          <w:hyperlink w:anchor="__RefHeading___Toc11724_3742996938">
             <w:r>
               <w:rPr>
                 <w:webHidden/>
@@ -2432,7 +2432,7 @@
             </w:tabs>
             <w:rPr/>
           </w:pPr>
-          <w:hyperlink w:anchor="__RefHeading___Toc11698_1805670434">
+          <w:hyperlink w:anchor="__RefHeading___Toc11726_3742996938">
             <w:r>
               <w:rPr>
                 <w:webHidden/>
@@ -2453,7 +2453,7 @@
             </w:tabs>
             <w:rPr/>
           </w:pPr>
-          <w:hyperlink w:anchor="__RefHeading___Toc11700_1805670434">
+          <w:hyperlink w:anchor="__RefHeading___Toc11728_3742996938">
             <w:r>
               <w:rPr>
                 <w:webHidden/>
@@ -2474,7 +2474,7 @@
             </w:tabs>
             <w:rPr/>
           </w:pPr>
-          <w:hyperlink w:anchor="__RefHeading___Toc11702_1805670434">
+          <w:hyperlink w:anchor="__RefHeading___Toc11730_3742996938">
             <w:r>
               <w:rPr>
                 <w:webHidden/>
@@ -2495,7 +2495,7 @@
             </w:tabs>
             <w:rPr/>
           </w:pPr>
-          <w:hyperlink w:anchor="__RefHeading___Toc11704_1805670434">
+          <w:hyperlink w:anchor="__RefHeading___Toc11732_3742996938">
             <w:r>
               <w:rPr>
                 <w:webHidden/>
@@ -2516,7 +2516,7 @@
             </w:tabs>
             <w:rPr/>
           </w:pPr>
-          <w:hyperlink w:anchor="__RefHeading___Toc11706_1805670434">
+          <w:hyperlink w:anchor="__RefHeading___Toc11734_3742996938">
             <w:r>
               <w:rPr>
                 <w:webHidden/>
@@ -2537,7 +2537,7 @@
             </w:tabs>
             <w:rPr/>
           </w:pPr>
-          <w:hyperlink w:anchor="__RefHeading___Toc11708_1805670434">
+          <w:hyperlink w:anchor="__RefHeading___Toc11736_3742996938">
             <w:r>
               <w:rPr>
                 <w:webHidden/>
@@ -2558,7 +2558,7 @@
             </w:tabs>
             <w:rPr/>
           </w:pPr>
-          <w:hyperlink w:anchor="__RefHeading___Toc11710_1805670434">
+          <w:hyperlink w:anchor="__RefHeading___Toc11738_3742996938">
             <w:r>
               <w:rPr>
                 <w:webHidden/>
@@ -2579,7 +2579,7 @@
             </w:tabs>
             <w:rPr/>
           </w:pPr>
-          <w:hyperlink w:anchor="__RefHeading___Toc11712_1805670434">
+          <w:hyperlink w:anchor="__RefHeading___Toc11740_3742996938">
             <w:r>
               <w:rPr>
                 <w:webHidden/>
@@ -2600,7 +2600,7 @@
             </w:tabs>
             <w:rPr/>
           </w:pPr>
-          <w:hyperlink w:anchor="__RefHeading___Toc11714_1805670434">
+          <w:hyperlink w:anchor="__RefHeading___Toc11742_3742996938">
             <w:r>
               <w:rPr>
                 <w:webHidden/>
@@ -2621,7 +2621,7 @@
             </w:tabs>
             <w:rPr/>
           </w:pPr>
-          <w:hyperlink w:anchor="__RefHeading___Toc11716_1805670434">
+          <w:hyperlink w:anchor="__RefHeading___Toc11744_3742996938">
             <w:r>
               <w:rPr>
                 <w:webHidden/>
@@ -2642,7 +2642,7 @@
             </w:tabs>
             <w:rPr/>
           </w:pPr>
-          <w:hyperlink w:anchor="__RefHeading___Toc11718_1805670434">
+          <w:hyperlink w:anchor="__RefHeading___Toc11746_3742996938">
             <w:r>
               <w:rPr>
                 <w:webHidden/>
@@ -2663,7 +2663,7 @@
             </w:tabs>
             <w:rPr/>
           </w:pPr>
-          <w:hyperlink w:anchor="__RefHeading___Toc11720_1805670434">
+          <w:hyperlink w:anchor="__RefHeading___Toc11748_3742996938">
             <w:r>
               <w:rPr>
                 <w:webHidden/>
@@ -2684,7 +2684,7 @@
             </w:tabs>
             <w:rPr/>
           </w:pPr>
-          <w:hyperlink w:anchor="__RefHeading___Toc11722_1805670434">
+          <w:hyperlink w:anchor="__RefHeading___Toc11750_3742996938">
             <w:r>
               <w:rPr>
                 <w:webHidden/>
@@ -2705,7 +2705,7 @@
             </w:tabs>
             <w:rPr/>
           </w:pPr>
-          <w:hyperlink w:anchor="__RefHeading___Toc11724_1805670434">
+          <w:hyperlink w:anchor="__RefHeading___Toc11752_3742996938">
             <w:r>
               <w:rPr>
                 <w:webHidden/>
@@ -2726,7 +2726,7 @@
             </w:tabs>
             <w:rPr/>
           </w:pPr>
-          <w:hyperlink w:anchor="__RefHeading___Toc11726_1805670434">
+          <w:hyperlink w:anchor="__RefHeading___Toc11754_3742996938">
             <w:r>
               <w:rPr>
                 <w:webHidden/>
@@ -2747,7 +2747,7 @@
             </w:tabs>
             <w:rPr/>
           </w:pPr>
-          <w:hyperlink w:anchor="__RefHeading___Toc11728_1805670434">
+          <w:hyperlink w:anchor="__RefHeading___Toc11756_3742996938">
             <w:r>
               <w:rPr>
                 <w:webHidden/>
@@ -2768,7 +2768,7 @@
             </w:tabs>
             <w:rPr/>
           </w:pPr>
-          <w:hyperlink w:anchor="__RefHeading___Toc11730_1805670434">
+          <w:hyperlink w:anchor="__RefHeading___Toc11758_3742996938">
             <w:r>
               <w:rPr>
                 <w:webHidden/>
@@ -2789,7 +2789,7 @@
             </w:tabs>
             <w:rPr/>
           </w:pPr>
-          <w:hyperlink w:anchor="__RefHeading___Toc11732_1805670434">
+          <w:hyperlink w:anchor="__RefHeading___Toc11760_3742996938">
             <w:r>
               <w:rPr>
                 <w:webHidden/>
@@ -4295,7 +4295,7 @@
         <w:spacing w:before="0" w:after="120"/>
         <w:rPr/>
       </w:pPr>
-      <w:bookmarkStart w:id="2" w:name="__RefHeading___Toc11478_1805670434"/>
+      <w:bookmarkStart w:id="2" w:name="__RefHeading___Toc11506_3742996938"/>
       <w:bookmarkEnd w:id="2"/>
       <w:r>
         <w:rPr>
@@ -4347,7 +4347,7 @@
         <w:spacing w:before="360" w:after="120"/>
         <w:rPr/>
       </w:pPr>
-      <w:bookmarkStart w:id="3" w:name="__RefHeading___Toc11480_1805670434"/>
+      <w:bookmarkStart w:id="3" w:name="__RefHeading___Toc11508_3742996938"/>
       <w:bookmarkStart w:id="4" w:name="introduction"/>
       <w:bookmarkEnd w:id="3"/>
       <w:r>
@@ -4378,7 +4378,7 @@
         <w:spacing w:before="280" w:after="80"/>
         <w:rPr/>
       </w:pPr>
-      <w:bookmarkStart w:id="5" w:name="__RefHeading___Toc11482_1805670434"/>
+      <w:bookmarkStart w:id="5" w:name="__RefHeading___Toc11510_3742996938"/>
       <w:bookmarkStart w:id="6" w:name="what-this-book-is"/>
       <w:bookmarkEnd w:id="5"/>
       <w:r>
@@ -4525,7 +4525,7 @@
         <w:spacing w:before="280" w:after="80"/>
         <w:rPr/>
       </w:pPr>
-      <w:bookmarkStart w:id="7" w:name="__RefHeading___Toc11484_1805670434"/>
+      <w:bookmarkStart w:id="7" w:name="__RefHeading___Toc11512_3742996938"/>
       <w:bookmarkStart w:id="8" w:name="what-kestrel-is"/>
       <w:bookmarkEnd w:id="7"/>
       <w:r>
@@ -4652,7 +4652,7 @@
         <w:spacing w:before="280" w:after="80"/>
         <w:rPr/>
       </w:pPr>
-      <w:bookmarkStart w:id="10" w:name="__RefHeading___Toc11486_1805670434"/>
+      <w:bookmarkStart w:id="10" w:name="__RefHeading___Toc11514_3742996938"/>
       <w:bookmarkStart w:id="11" w:name="why-single-cycle-comes-first"/>
       <w:bookmarkEnd w:id="10"/>
       <w:r>
@@ -4709,7 +4709,7 @@
         <w:spacing w:before="280" w:after="80"/>
         <w:rPr/>
       </w:pPr>
-      <w:bookmarkStart w:id="13" w:name="__RefHeading___Toc11488_1805670434"/>
+      <w:bookmarkStart w:id="13" w:name="__RefHeading___Toc11516_3742996938"/>
       <w:bookmarkStart w:id="14" w:name="how-to-read-this-book"/>
       <w:bookmarkEnd w:id="13"/>
       <w:r>
@@ -4833,7 +4833,7 @@
         <w:spacing w:before="360" w:after="120"/>
         <w:rPr/>
       </w:pPr>
-      <w:bookmarkStart w:id="15" w:name="__RefHeading___Toc11490_1805670434"/>
+      <w:bookmarkStart w:id="15" w:name="__RefHeading___Toc11518_3742996938"/>
       <w:bookmarkStart w:id="16" w:name="the-falcon-ladder"/>
       <w:bookmarkEnd w:id="15"/>
       <w:r>
@@ -4864,7 +4864,7 @@
         <w:spacing w:before="280" w:after="80"/>
         <w:rPr/>
       </w:pPr>
-      <w:bookmarkStart w:id="17" w:name="__RefHeading___Toc11492_1805670434"/>
+      <w:bookmarkStart w:id="17" w:name="__RefHeading___Toc11520_3742996938"/>
       <w:bookmarkStart w:id="18" w:name="the-suite"/>
       <w:bookmarkEnd w:id="17"/>
       <w:r>
@@ -5595,7 +5595,7 @@
         <w:spacing w:before="200" w:after="80"/>
         <w:rPr/>
       </w:pPr>
-      <w:bookmarkStart w:id="20" w:name="__RefHeading___Toc11494_1805670434"/>
+      <w:bookmarkStart w:id="20" w:name="__RefHeading___Toc11522_3742996938"/>
       <w:bookmarkStart w:id="21" w:name="_Fig_1_The_falcon_ladder__s"/>
       <w:bookmarkEnd w:id="20"/>
       <w:r>
@@ -5697,7 +5697,7 @@
         <w:spacing w:before="280" w:after="80"/>
         <w:rPr/>
       </w:pPr>
-      <w:bookmarkStart w:id="23" w:name="__RefHeading___Toc11496_1805670434"/>
+      <w:bookmarkStart w:id="23" w:name="__RefHeading___Toc11524_3742996938"/>
       <w:bookmarkStart w:id="24" w:name="what-each-rung-teaches"/>
       <w:bookmarkEnd w:id="23"/>
       <w:r>
@@ -5813,7 +5813,7 @@
         <w:spacing w:before="280" w:after="80"/>
         <w:rPr/>
       </w:pPr>
-      <w:bookmarkStart w:id="25" w:name="__RefHeading___Toc11498_1805670434"/>
+      <w:bookmarkStart w:id="25" w:name="__RefHeading___Toc11526_3742996938"/>
       <w:bookmarkStart w:id="26" w:name="why-kestrel-is-rung-1"/>
       <w:bookmarkEnd w:id="25"/>
       <w:r>
@@ -5891,7 +5891,7 @@
         <w:spacing w:before="360" w:after="120"/>
         <w:rPr/>
       </w:pPr>
-      <w:bookmarkStart w:id="27" w:name="__RefHeading___Toc11500_1805670434"/>
+      <w:bookmarkStart w:id="27" w:name="__RefHeading___Toc11528_3742996938"/>
       <w:bookmarkStart w:id="28" w:name="conventions"/>
       <w:bookmarkEnd w:id="27"/>
       <w:r>
@@ -5922,7 +5922,7 @@
         <w:spacing w:before="280" w:after="80"/>
         <w:rPr/>
       </w:pPr>
-      <w:bookmarkStart w:id="29" w:name="__RefHeading___Toc11502_1805670434"/>
+      <w:bookmarkStart w:id="29" w:name="__RefHeading___Toc11530_3742996938"/>
       <w:bookmarkStart w:id="30" w:name="numbers-and-identifiers"/>
       <w:bookmarkEnd w:id="29"/>
       <w:r>
@@ -6056,7 +6056,7 @@
         <w:spacing w:before="280" w:after="80"/>
         <w:rPr/>
       </w:pPr>
-      <w:bookmarkStart w:id="31" w:name="__RefHeading___Toc11504_1805670434"/>
+      <w:bookmarkStart w:id="31" w:name="__RefHeading___Toc11532_3742996938"/>
       <w:bookmarkStart w:id="32" w:name="register-names"/>
       <w:bookmarkEnd w:id="31"/>
       <w:r>
@@ -6165,7 +6165,7 @@
         <w:spacing w:before="280" w:after="80"/>
         <w:rPr/>
       </w:pPr>
-      <w:bookmarkStart w:id="33" w:name="__RefHeading___Toc11506_1805670434"/>
+      <w:bookmarkStart w:id="33" w:name="__RefHeading___Toc11534_3742996938"/>
       <w:bookmarkStart w:id="34" w:name="halt-versus-trap"/>
       <w:bookmarkEnd w:id="33"/>
       <w:r>
@@ -6302,7 +6302,7 @@
         <w:spacing w:before="280" w:after="80"/>
         <w:rPr/>
       </w:pPr>
-      <w:bookmarkStart w:id="36" w:name="__RefHeading___Toc11508_1805670434"/>
+      <w:bookmarkStart w:id="36" w:name="__RefHeading___Toc11536_3742996938"/>
       <w:bookmarkStart w:id="37" w:name="rvfi"/>
       <w:bookmarkEnd w:id="36"/>
       <w:r>
@@ -6359,7 +6359,7 @@
         <w:spacing w:before="280" w:after="80"/>
         <w:rPr/>
       </w:pPr>
-      <w:bookmarkStart w:id="38" w:name="__RefHeading___Toc11510_1805670434"/>
+      <w:bookmarkStart w:id="38" w:name="__RefHeading___Toc11538_3742996938"/>
       <w:bookmarkStart w:id="39" w:name="citations"/>
       <w:bookmarkEnd w:id="38"/>
       <w:r>
@@ -6451,7 +6451,7 @@
         <w:spacing w:before="360" w:after="120"/>
         <w:rPr/>
       </w:pPr>
-      <w:bookmarkStart w:id="40" w:name="__RefHeading___Toc11512_1805670434"/>
+      <w:bookmarkStart w:id="40" w:name="__RefHeading___Toc11540_3742996938"/>
       <w:bookmarkStart w:id="41" w:name="instruction-formats"/>
       <w:bookmarkEnd w:id="40"/>
       <w:r>
@@ -6482,7 +6482,7 @@
         <w:spacing w:before="280" w:after="80"/>
         <w:rPr/>
       </w:pPr>
-      <w:bookmarkStart w:id="42" w:name="__RefHeading___Toc11514_1805670434"/>
+      <w:bookmarkStart w:id="42" w:name="__RefHeading___Toc11542_3742996938"/>
       <w:bookmarkStart w:id="43" w:name="six-formats-one-word"/>
       <w:bookmarkEnd w:id="42"/>
       <w:r>
@@ -8158,7 +8158,7 @@
         <w:spacing w:before="280" w:after="80"/>
         <w:rPr/>
       </w:pPr>
-      <w:bookmarkStart w:id="46" w:name="__RefHeading___Toc11516_1805670434"/>
+      <w:bookmarkStart w:id="46" w:name="__RefHeading___Toc11544_3742996938"/>
       <w:bookmarkStart w:id="47" w:name="how-kestrel-decodes-a-format"/>
       <w:bookmarkEnd w:id="46"/>
       <w:r>
@@ -8254,7 +8254,7 @@
         <w:spacing w:before="280" w:after="80"/>
         <w:rPr/>
       </w:pPr>
-      <w:bookmarkStart w:id="48" w:name="__RefHeading___Toc11518_1805670434"/>
+      <w:bookmarkStart w:id="48" w:name="__RefHeading___Toc11546_3742996938"/>
       <w:bookmarkStart w:id="49" w:name="immediate-assembly"/>
       <w:bookmarkEnd w:id="48"/>
       <w:r>
@@ -9001,7 +9001,7 @@
         <w:spacing w:before="280" w:after="80"/>
         <w:rPr/>
       </w:pPr>
-      <w:bookmarkStart w:id="51" w:name="__RefHeading___Toc11520_1805670434"/>
+      <w:bookmarkStart w:id="51" w:name="__RefHeading___Toc11548_3742996938"/>
       <w:bookmarkStart w:id="52" w:name="shift-immediates"/>
       <w:bookmarkEnd w:id="51"/>
       <w:r>
@@ -9152,7 +9152,7 @@
         <w:spacing w:before="360" w:after="120"/>
         <w:rPr/>
       </w:pPr>
-      <w:bookmarkStart w:id="53" w:name="__RefHeading___Toc11522_1805670434"/>
+      <w:bookmarkStart w:id="53" w:name="__RefHeading___Toc11550_3742996938"/>
       <w:bookmarkStart w:id="54" w:name="the-instruction-set"/>
       <w:bookmarkEnd w:id="53"/>
       <w:r>
@@ -9183,7 +9183,7 @@
         <w:spacing w:before="280" w:after="80"/>
         <w:rPr/>
       </w:pPr>
-      <w:bookmarkStart w:id="55" w:name="__RefHeading___Toc11524_1805670434"/>
+      <w:bookmarkStart w:id="55" w:name="__RefHeading___Toc11552_3742996938"/>
       <w:bookmarkStart w:id="56" w:name="the-thirty-seven"/>
       <w:bookmarkEnd w:id="55"/>
       <w:r>
@@ -9223,7 +9223,7 @@
         <w:spacing w:before="200" w:after="80"/>
         <w:rPr/>
       </w:pPr>
-      <w:bookmarkStart w:id="57" w:name="__RefHeading___Toc11526_1805670434"/>
+      <w:bookmarkStart w:id="57" w:name="__RefHeading___Toc11554_3742996938"/>
       <w:bookmarkEnd w:id="57"/>
       <w:r>
         <w:rPr>
@@ -10705,7 +10705,7 @@
         <w:spacing w:before="200" w:after="80"/>
         <w:rPr/>
       </w:pPr>
-      <w:bookmarkStart w:id="60" w:name="__RefHeading___Toc11528_1805670434"/>
+      <w:bookmarkStart w:id="60" w:name="__RefHeading___Toc11556_3742996938"/>
       <w:bookmarkEnd w:id="60"/>
       <w:r>
         <w:rPr>
@@ -12083,7 +12083,7 @@
         <w:spacing w:before="200" w:after="80"/>
         <w:rPr/>
       </w:pPr>
-      <w:bookmarkStart w:id="62" w:name="__RefHeading___Toc11530_1805670434"/>
+      <w:bookmarkStart w:id="62" w:name="__RefHeading___Toc11558_3742996938"/>
       <w:bookmarkStart w:id="63" w:name="loads-and-stores"/>
       <w:bookmarkEnd w:id="62"/>
       <w:r>
@@ -13609,7 +13609,7 @@
         <w:spacing w:before="200" w:after="80"/>
         <w:rPr/>
       </w:pPr>
-      <w:bookmarkStart w:id="66" w:name="__RefHeading___Toc11532_1805670434"/>
+      <w:bookmarkStart w:id="66" w:name="__RefHeading___Toc11560_3742996938"/>
       <w:bookmarkStart w:id="67" w:name="branches"/>
       <w:bookmarkEnd w:id="66"/>
       <w:r>
@@ -14609,7 +14609,7 @@
         <w:spacing w:before="200" w:after="80"/>
         <w:rPr/>
       </w:pPr>
-      <w:bookmarkStart w:id="69" w:name="__RefHeading___Toc11534_1805670434"/>
+      <w:bookmarkStart w:id="69" w:name="__RefHeading___Toc11562_3742996938"/>
       <w:bookmarkStart w:id="70" w:name="jumps-and-upper-immediates"/>
       <w:bookmarkEnd w:id="69"/>
       <w:r>
@@ -15397,7 +15397,7 @@
         <w:spacing w:before="280" w:after="80"/>
         <w:rPr/>
       </w:pPr>
-      <w:bookmarkStart w:id="72" w:name="__RefHeading___Toc11536_1805670434"/>
+      <w:bookmarkStart w:id="72" w:name="__RefHeading___Toc11564_3742996938"/>
       <w:bookmarkStart w:id="73" w:name="reserved-encodings"/>
       <w:bookmarkEnd w:id="72"/>
       <w:r>
@@ -15496,7 +15496,7 @@
         <w:spacing w:before="360" w:after="120"/>
         <w:rPr/>
       </w:pPr>
-      <w:bookmarkStart w:id="74" w:name="__RefHeading___Toc11538_1805670434"/>
+      <w:bookmarkStart w:id="74" w:name="__RefHeading___Toc11566_3742996938"/>
       <w:bookmarkStart w:id="75" w:name="the-system-layer-stubs-nops-and-halts"/>
       <w:bookmarkEnd w:id="74"/>
       <w:r>
@@ -15527,7 +15527,7 @@
         <w:spacing w:before="280" w:after="80"/>
         <w:rPr/>
       </w:pPr>
-      <w:bookmarkStart w:id="76" w:name="__RefHeading___Toc11540_1805670434"/>
+      <w:bookmarkStart w:id="76" w:name="__RefHeading___Toc11568_3742996938"/>
       <w:bookmarkStart w:id="77" w:name="what-rv32i-surrounds-itself-with"/>
       <w:bookmarkEnd w:id="76"/>
       <w:r>
@@ -15572,7 +15572,7 @@
         <w:spacing w:before="280" w:after="80"/>
         <w:rPr/>
       </w:pPr>
-      <w:bookmarkStart w:id="79" w:name="__RefHeading___Toc11542_1805670434"/>
+      <w:bookmarkStart w:id="79" w:name="__RefHeading___Toc11570_3742996938"/>
       <w:bookmarkStart w:id="80" w:name="fence-and-fence.i-retire-as-nops"/>
       <w:bookmarkEnd w:id="79"/>
       <w:r>
@@ -15656,7 +15656,7 @@
         <w:spacing w:before="280" w:after="80"/>
         <w:rPr/>
       </w:pPr>
-      <w:bookmarkStart w:id="81" w:name="__RefHeading___Toc11544_1805670434"/>
+      <w:bookmarkStart w:id="81" w:name="__RefHeading___Toc11572_3742996938"/>
       <w:bookmarkStart w:id="82" w:name="ecall-and-ebreak-halt"/>
       <w:bookmarkEnd w:id="81"/>
       <w:r>
@@ -15778,7 +15778,7 @@
         <w:spacing w:before="280" w:after="80"/>
         <w:rPr/>
       </w:pPr>
-      <w:bookmarkStart w:id="83" w:name="__RefHeading___Toc11546_1805670434"/>
+      <w:bookmarkStart w:id="83" w:name="__RefHeading___Toc11574_3742996938"/>
       <w:bookmarkStart w:id="84" w:name="mret-falls-through"/>
       <w:bookmarkEnd w:id="83"/>
       <w:r>
@@ -15861,7 +15861,7 @@
         <w:spacing w:before="280" w:after="80"/>
         <w:rPr/>
       </w:pPr>
-      <w:bookmarkStart w:id="85" w:name="__RefHeading___Toc11548_1805670434"/>
+      <w:bookmarkStart w:id="85" w:name="__RefHeading___Toc11576_3742996938"/>
       <w:bookmarkStart w:id="86" w:name="the-csr-class-retires-as-a-bounded-stub"/>
       <w:bookmarkEnd w:id="85"/>
       <w:r>
@@ -16009,7 +16009,7 @@
         <w:spacing w:before="280" w:after="80"/>
         <w:rPr/>
       </w:pPr>
-      <w:bookmarkStart w:id="88" w:name="__RefHeading___Toc11550_1805670434"/>
+      <w:bookmarkStart w:id="88" w:name="__RefHeading___Toc11578_3742996938"/>
       <w:bookmarkStart w:id="89" w:name="halt-causes-collected"/>
       <w:bookmarkEnd w:id="88"/>
       <w:r>
@@ -16822,7 +16822,7 @@
         <w:spacing w:before="360" w:after="120"/>
         <w:rPr/>
       </w:pPr>
-      <w:bookmarkStart w:id="91" w:name="__RefHeading___Toc11552_1805670434"/>
+      <w:bookmarkStart w:id="91" w:name="__RefHeading___Toc11580_3742996938"/>
       <w:bookmarkStart w:id="92" w:name="datapath-overview"/>
       <w:bookmarkEnd w:id="91"/>
       <w:r>
@@ -16853,7 +16853,7 @@
         <w:spacing w:before="280" w:after="80"/>
         <w:rPr/>
       </w:pPr>
-      <w:bookmarkStart w:id="93" w:name="__RefHeading___Toc11554_1805670434"/>
+      <w:bookmarkStart w:id="93" w:name="__RefHeading___Toc11582_3742996938"/>
       <w:bookmarkStart w:id="94" w:name="the-machine-in-one-picture"/>
       <w:bookmarkEnd w:id="93"/>
       <w:r>
@@ -16919,7 +16919,7 @@
         <w:spacing w:before="200" w:after="80"/>
         <w:rPr/>
       </w:pPr>
-      <w:bookmarkStart w:id="95" w:name="__RefHeading___Toc11556_1805670434"/>
+      <w:bookmarkStart w:id="95" w:name="__RefHeading___Toc11584_3742996938"/>
       <w:bookmarkStart w:id="96" w:name="figure-3.1-kestrel-block-diagram"/>
       <w:bookmarkStart w:id="97" w:name="_Fig_2_kestrel_block_diagra"/>
       <w:bookmarkEnd w:id="95"/>
@@ -17035,7 +17035,7 @@
         <w:spacing w:before="280" w:after="80"/>
         <w:rPr/>
       </w:pPr>
-      <w:bookmarkStart w:id="98" w:name="__RefHeading___Toc11558_1805670434"/>
+      <w:bookmarkStart w:id="98" w:name="__RefHeading___Toc11586_3742996938"/>
       <w:bookmarkEnd w:id="98"/>
       <w:r>
         <w:rPr>
@@ -17705,7 +17705,7 @@
                 <w:szCs w:val="24"/>
                 <w:lang w:val="en-US" w:eastAsia="en-US" w:bidi="ar-SA"/>
               </w:rPr>
-              <w:t xml:space="preserve"> to a 14-field control bundle</w:t>
+              <w:t xml:space="preserve"> to a thirteen-field control bundle</w:t>
             </w:r>
           </w:p>
         </w:tc>
@@ -17849,7 +17849,7 @@
         <w:spacing w:before="280" w:after="80"/>
         <w:rPr/>
       </w:pPr>
-      <w:bookmarkStart w:id="101" w:name="__RefHeading___Toc11560_1805670434"/>
+      <w:bookmarkStart w:id="101" w:name="__RefHeading___Toc11588_3742996938"/>
       <w:bookmarkEnd w:id="101"/>
       <w:r>
         <w:rPr>
@@ -18549,7 +18549,7 @@
         <w:spacing w:before="280" w:after="80"/>
         <w:rPr/>
       </w:pPr>
-      <w:bookmarkStart w:id="103" w:name="__RefHeading___Toc11562_1805670434"/>
+      <w:bookmarkStart w:id="103" w:name="__RefHeading___Toc11590_3742996938"/>
       <w:bookmarkStart w:id="104" w:name="reading-the-chapters-that-follow"/>
       <w:bookmarkEnd w:id="103"/>
       <w:r>
@@ -18687,7 +18687,7 @@
         <w:spacing w:before="360" w:after="120"/>
         <w:rPr/>
       </w:pPr>
-      <w:bookmarkStart w:id="105" w:name="__RefHeading___Toc11564_1805670434"/>
+      <w:bookmarkStart w:id="105" w:name="__RefHeading___Toc11592_3742996938"/>
       <w:bookmarkStart w:id="106" w:name="one-cycle-end-to-end"/>
       <w:bookmarkEnd w:id="105"/>
       <w:r>
@@ -18718,7 +18718,7 @@
         <w:spacing w:before="280" w:after="80"/>
         <w:rPr/>
       </w:pPr>
-      <w:bookmarkStart w:id="107" w:name="__RefHeading___Toc11566_1805670434"/>
+      <w:bookmarkStart w:id="107" w:name="__RefHeading___Toc11594_3742996938"/>
       <w:bookmarkStart w:id="108" w:name="the-clock-in-one-sentence"/>
       <w:bookmarkEnd w:id="107"/>
       <w:r>
@@ -18788,7 +18788,7 @@
         <w:spacing w:before="280" w:after="80"/>
         <w:rPr/>
       </w:pPr>
-      <w:bookmarkStart w:id="110" w:name="__RefHeading___Toc11568_1805670434"/>
+      <w:bookmarkStart w:id="110" w:name="__RefHeading___Toc11596_3742996938"/>
       <w:bookmarkStart w:id="111" w:name="fetch-and-decode"/>
       <w:bookmarkEnd w:id="110"/>
       <w:r>
@@ -19034,7 +19034,7 @@
         <w:spacing w:before="280" w:after="80"/>
         <w:rPr/>
       </w:pPr>
-      <w:bookmarkStart w:id="112" w:name="__RefHeading___Toc11570_1805670434"/>
+      <w:bookmarkStart w:id="112" w:name="__RefHeading___Toc11598_3742996938"/>
       <w:bookmarkStart w:id="113" w:name="operands-and-immediates"/>
       <w:bookmarkEnd w:id="112"/>
       <w:r>
@@ -19169,7 +19169,7 @@
         <w:spacing w:before="280" w:after="80"/>
         <w:rPr/>
       </w:pPr>
-      <w:bookmarkStart w:id="114" w:name="__RefHeading___Toc11572_1805670434"/>
+      <w:bookmarkStart w:id="114" w:name="__RefHeading___Toc11600_3742996938"/>
       <w:bookmarkStart w:id="115" w:name="execute"/>
       <w:bookmarkEnd w:id="114"/>
       <w:r>
@@ -19291,7 +19291,7 @@
         <w:spacing w:before="280" w:after="80"/>
         <w:rPr/>
       </w:pPr>
-      <w:bookmarkStart w:id="116" w:name="__RefHeading___Toc11574_1805670434"/>
+      <w:bookmarkStart w:id="116" w:name="__RefHeading___Toc11602_3742996938"/>
       <w:bookmarkStart w:id="117" w:name="next-pc-selection"/>
       <w:bookmarkEnd w:id="116"/>
       <w:r>
@@ -19466,7 +19466,7 @@
         <w:spacing w:before="280" w:after="80"/>
         <w:rPr/>
       </w:pPr>
-      <w:bookmarkStart w:id="118" w:name="__RefHeading___Toc11576_1805670434"/>
+      <w:bookmarkStart w:id="118" w:name="__RefHeading___Toc11604_3742996938"/>
       <w:bookmarkStart w:id="119" w:name="memory-access"/>
       <w:bookmarkEnd w:id="118"/>
       <w:r>
@@ -19549,7 +19549,7 @@
         <w:spacing w:before="280" w:after="80"/>
         <w:rPr/>
       </w:pPr>
-      <w:bookmarkStart w:id="120" w:name="__RefHeading___Toc11578_1805670434"/>
+      <w:bookmarkStart w:id="120" w:name="__RefHeading___Toc11606_3742996938"/>
       <w:bookmarkStart w:id="121" w:name="writeback"/>
       <w:bookmarkEnd w:id="120"/>
       <w:r>
@@ -19747,7 +19747,7 @@
         <w:spacing w:before="280" w:after="80"/>
         <w:rPr/>
       </w:pPr>
-      <w:bookmarkStart w:id="122" w:name="__RefHeading___Toc11580_1805670434"/>
+      <w:bookmarkStart w:id="122" w:name="__RefHeading___Toc11608_3742996938"/>
       <w:bookmarkStart w:id="123" w:name="two-worked-examples"/>
       <w:bookmarkEnd w:id="122"/>
       <w:r>
@@ -19924,7 +19924,7 @@
         <w:spacing w:before="360" w:after="120"/>
         <w:rPr/>
       </w:pPr>
-      <w:bookmarkStart w:id="124" w:name="__RefHeading___Toc11582_1805670434"/>
+      <w:bookmarkStart w:id="124" w:name="__RefHeading___Toc11610_3742996938"/>
       <w:bookmarkStart w:id="125" w:name="control-state"/>
       <w:bookmarkEnd w:id="124"/>
       <w:r>
@@ -19955,7 +19955,7 @@
         <w:spacing w:before="280" w:after="80"/>
         <w:rPr/>
       </w:pPr>
-      <w:bookmarkStart w:id="126" w:name="__RefHeading___Toc11584_1805670434"/>
+      <w:bookmarkStart w:id="126" w:name="__RefHeading___Toc11612_3742996938"/>
       <w:bookmarkStart w:id="127" w:name="why-there-is-no-fsm"/>
       <w:bookmarkEnd w:id="126"/>
       <w:r>
@@ -20012,7 +20012,7 @@
         <w:spacing w:before="280" w:after="80"/>
         <w:rPr/>
       </w:pPr>
-      <w:bookmarkStart w:id="129" w:name="__RefHeading___Toc11586_1805670434"/>
+      <w:bookmarkStart w:id="129" w:name="__RefHeading___Toc11614_3742996938"/>
       <w:bookmarkStart w:id="130" w:name="the-halt-holding-register"/>
       <w:bookmarkEnd w:id="129"/>
       <w:r>
@@ -20302,7 +20302,7 @@
         <w:spacing w:before="280" w:after="80"/>
         <w:rPr/>
       </w:pPr>
-      <w:bookmarkStart w:id="132" w:name="__RefHeading___Toc11588_1805670434"/>
+      <w:bookmarkStart w:id="132" w:name="__RefHeading___Toc11616_3742996938"/>
       <w:bookmarkStart w:id="133" w:name="the-retry-bit-and-the-merge-register"/>
       <w:bookmarkEnd w:id="132"/>
       <w:r>
@@ -20443,7 +20443,7 @@
         <w:spacing w:before="280" w:after="80"/>
         <w:rPr/>
       </w:pPr>
-      <w:bookmarkStart w:id="134" w:name="__RefHeading___Toc11590_1805670434"/>
+      <w:bookmarkStart w:id="134" w:name="__RefHeading___Toc11618_3742996938"/>
       <w:bookmarkStart w:id="135" w:name="the-retirement-counter"/>
       <w:bookmarkEnd w:id="134"/>
       <w:r>
@@ -20520,7 +20520,7 @@
         <w:spacing w:before="280" w:after="80"/>
         <w:rPr/>
       </w:pPr>
-      <w:bookmarkStart w:id="136" w:name="__RefHeading___Toc11592_1805670434"/>
+      <w:bookmarkStart w:id="136" w:name="__RefHeading___Toc11620_3742996938"/>
       <w:bookmarkStart w:id="137" w:name="what-this-buys"/>
       <w:bookmarkEnd w:id="136"/>
       <w:r>
@@ -20599,7 +20599,7 @@
         <w:spacing w:before="360" w:after="120"/>
         <w:rPr/>
       </w:pPr>
-      <w:bookmarkStart w:id="138" w:name="__RefHeading___Toc11594_1805670434"/>
+      <w:bookmarkStart w:id="138" w:name="__RefHeading___Toc11622_3742996938"/>
       <w:bookmarkStart w:id="139" w:name="the-rvfi-retire-interface"/>
       <w:bookmarkEnd w:id="138"/>
       <w:r>
@@ -20630,7 +20630,7 @@
         <w:spacing w:before="280" w:after="80"/>
         <w:rPr/>
       </w:pPr>
-      <w:bookmarkStart w:id="140" w:name="__RefHeading___Toc11596_1805670434"/>
+      <w:bookmarkStart w:id="140" w:name="__RefHeading___Toc11624_3742996938"/>
       <w:bookmarkStart w:id="141" w:name="retirement-as-the-observation-channel"/>
       <w:bookmarkEnd w:id="140"/>
       <w:r>
@@ -20675,7 +20675,7 @@
         <w:spacing w:before="280" w:after="80"/>
         <w:rPr/>
       </w:pPr>
-      <w:bookmarkStart w:id="143" w:name="__RefHeading___Toc11598_1805670434"/>
+      <w:bookmarkStart w:id="143" w:name="__RefHeading___Toc11626_3742996938"/>
       <w:bookmarkEnd w:id="143"/>
       <w:r>
         <w:rPr>
@@ -22235,7 +22235,7 @@
         <w:spacing w:before="280" w:after="80"/>
         <w:rPr/>
       </w:pPr>
-      <w:bookmarkStart w:id="146" w:name="__RefHeading___Toc11600_1805670434"/>
+      <w:bookmarkStart w:id="146" w:name="__RefHeading___Toc11628_3742996938"/>
       <w:bookmarkEnd w:id="146"/>
       <w:r>
         <w:rPr>
@@ -22336,7 +22336,7 @@
       </w:r>
       <w:r>
         <w:rPr/>
-        <w:t>, and the early core failed exactly there until the rule was pinned (Chapter 6). The register file independently discards the x0 write architecturally.</w:t>
+        <w:t>, and the early core failed exactly there until the rule was pinned. The register file independently discards the x0 write architecturally.</w:t>
       </w:r>
     </w:p>
     <w:p>
@@ -22450,7 +22450,7 @@
         <w:spacing w:before="280" w:after="80"/>
         <w:rPr/>
       </w:pPr>
-      <w:bookmarkStart w:id="147" w:name="__RefHeading___Toc11602_1805670434"/>
+      <w:bookmarkStart w:id="147" w:name="__RefHeading___Toc11630_3742996938"/>
       <w:bookmarkStart w:id="148" w:name="memory-field-packing"/>
       <w:bookmarkEnd w:id="147"/>
       <w:r>
@@ -22547,7 +22547,7 @@
         <w:spacing w:before="280" w:after="80"/>
         <w:rPr/>
       </w:pPr>
-      <w:bookmarkStart w:id="149" w:name="__RefHeading___Toc11604_1805670434"/>
+      <w:bookmarkStart w:id="149" w:name="__RefHeading___Toc11632_3742996938"/>
       <w:bookmarkStart w:id="150" w:name="why-this-pays"/>
       <w:bookmarkEnd w:id="149"/>
       <w:r>
@@ -22633,7 +22633,7 @@
         <w:spacing w:before="360" w:after="120"/>
         <w:rPr/>
       </w:pPr>
-      <w:bookmarkStart w:id="151" w:name="__RefHeading___Toc11606_1805670434"/>
+      <w:bookmarkStart w:id="151" w:name="__RefHeading___Toc11634_3742996938"/>
       <w:bookmarkStart w:id="152" w:name="the-control-bundle"/>
       <w:bookmarkEnd w:id="151"/>
       <w:r>
@@ -22664,7 +22664,7 @@
         <w:spacing w:before="280" w:after="80"/>
         <w:rPr/>
       </w:pPr>
-      <w:bookmarkStart w:id="153" w:name="__RefHeading___Toc11608_1805670434"/>
+      <w:bookmarkStart w:id="153" w:name="__RefHeading___Toc11636_3742996938"/>
       <w:bookmarkEnd w:id="153"/>
       <w:r>
         <w:rPr>
@@ -24129,7 +24129,7 @@
         <w:spacing w:before="280" w:after="80"/>
         <w:rPr/>
       </w:pPr>
-      <w:bookmarkStart w:id="156" w:name="__RefHeading___Toc11610_1805670434"/>
+      <w:bookmarkStart w:id="156" w:name="__RefHeading___Toc11638_3742996938"/>
       <w:bookmarkEnd w:id="156"/>
       <w:r>
         <w:rPr>
@@ -24235,7 +24235,7 @@
         <w:spacing w:before="280" w:after="80"/>
         <w:rPr/>
       </w:pPr>
-      <w:bookmarkStart w:id="157" w:name="__RefHeading___Toc11612_1805670434"/>
+      <w:bookmarkStart w:id="157" w:name="__RefHeading___Toc11640_3742996938"/>
       <w:bookmarkStart w:id="158" w:name="the-default-bundle"/>
       <w:bookmarkEnd w:id="157"/>
       <w:r>
@@ -24344,7 +24344,7 @@
         <w:spacing w:before="280" w:after="80"/>
         <w:rPr/>
       </w:pPr>
-      <w:bookmarkStart w:id="159" w:name="__RefHeading___Toc11614_1805670434"/>
+      <w:bookmarkStart w:id="159" w:name="__RefHeading___Toc11642_3742996938"/>
       <w:bookmarkStart w:id="160" w:name="reading-the-table"/>
       <w:bookmarkEnd w:id="159"/>
       <w:r>
@@ -24560,7 +24560,7 @@
         <w:spacing w:before="360" w:after="120"/>
         <w:rPr/>
       </w:pPr>
-      <w:bookmarkStart w:id="161" w:name="__RefHeading___Toc11616_1805670434"/>
+      <w:bookmarkStart w:id="161" w:name="__RefHeading___Toc11644_3742996938"/>
       <w:bookmarkStart w:id="162" w:name="the-decode-table"/>
       <w:bookmarkEnd w:id="161"/>
       <w:r>
@@ -24837,7 +24837,7 @@
         <w:spacing w:before="280" w:after="80"/>
         <w:rPr/>
       </w:pPr>
-      <w:bookmarkStart w:id="163" w:name="__RefHeading___Toc11618_1805670434"/>
+      <w:bookmarkStart w:id="163" w:name="__RefHeading___Toc11646_3742996938"/>
       <w:bookmarkEnd w:id="163"/>
       <w:r>
         <w:rPr>
@@ -29795,7 +29795,7 @@
         <w:spacing w:before="280" w:after="80"/>
         <w:rPr/>
       </w:pPr>
-      <w:bookmarkStart w:id="166" w:name="__RefHeading___Toc11620_1805670434"/>
+      <w:bookmarkStart w:id="166" w:name="__RefHeading___Toc11648_3742996938"/>
       <w:bookmarkEnd w:id="166"/>
       <w:r>
         <w:rPr>
@@ -33677,7 +33677,7 @@
         <w:spacing w:before="280" w:after="80"/>
         <w:rPr/>
       </w:pPr>
-      <w:bookmarkStart w:id="168" w:name="__RefHeading___Toc11622_1805670434"/>
+      <w:bookmarkStart w:id="168" w:name="__RefHeading___Toc11650_3742996938"/>
       <w:bookmarkEnd w:id="168"/>
       <w:r>
         <w:rPr>
@@ -35865,7 +35865,7 @@
         <w:spacing w:before="280" w:after="80"/>
         <w:rPr/>
       </w:pPr>
-      <w:bookmarkStart w:id="170" w:name="__RefHeading___Toc11624_1805670434"/>
+      <w:bookmarkStart w:id="170" w:name="__RefHeading___Toc11652_3742996938"/>
       <w:bookmarkEnd w:id="170"/>
       <w:r>
         <w:rPr>
@@ -36064,7 +36064,7 @@
         <w:spacing w:before="360" w:after="120"/>
         <w:rPr/>
       </w:pPr>
-      <w:bookmarkStart w:id="171" w:name="__RefHeading___Toc11626_1805670434"/>
+      <w:bookmarkStart w:id="171" w:name="__RefHeading___Toc11654_3742996938"/>
       <w:bookmarkStart w:id="172" w:name="the-memory-contract"/>
       <w:bookmarkEnd w:id="171"/>
       <w:r>
@@ -36095,7 +36095,7 @@
         <w:spacing w:before="280" w:after="80"/>
         <w:rPr/>
       </w:pPr>
-      <w:bookmarkStart w:id="173" w:name="__RefHeading___Toc11628_1805670434"/>
+      <w:bookmarkStart w:id="173" w:name="__RefHeading___Toc11656_3742996938"/>
       <w:bookmarkStart w:id="174" w:name="the-interface"/>
       <w:bookmarkEnd w:id="173"/>
       <w:r>
@@ -37463,7 +37463,7 @@
         <w:spacing w:before="280" w:after="80"/>
         <w:rPr/>
       </w:pPr>
-      <w:bookmarkStart w:id="176" w:name="__RefHeading___Toc11630_1805670434"/>
+      <w:bookmarkStart w:id="176" w:name="__RefHeading___Toc11658_3742996938"/>
       <w:bookmarkStart w:id="177" w:name="timing-one-cycle-except-when-documented"/>
       <w:bookmarkEnd w:id="176"/>
       <w:r>
@@ -37539,7 +37539,7 @@
         <w:spacing w:before="280" w:after="80"/>
         <w:rPr/>
       </w:pPr>
-      <w:bookmarkStart w:id="178" w:name="__RefHeading___Toc11632_1805670434"/>
+      <w:bookmarkStart w:id="178" w:name="__RefHeading___Toc11660_3742996938"/>
       <w:bookmarkStart w:id="179" w:name="what-the-contract-deliberately-excludes"/>
       <w:bookmarkEnd w:id="178"/>
       <w:r>
@@ -37693,7 +37693,7 @@
         <w:spacing w:before="360" w:after="120"/>
         <w:rPr/>
       </w:pPr>
-      <w:bookmarkStart w:id="180" w:name="__RefHeading___Toc11634_1805670434"/>
+      <w:bookmarkStart w:id="180" w:name="__RefHeading___Toc11662_3742996938"/>
       <w:bookmarkStart w:id="181" w:name="misaligned-data-accesses"/>
       <w:bookmarkEnd w:id="180"/>
       <w:r>
@@ -37724,7 +37724,7 @@
         <w:spacing w:before="280" w:after="80"/>
         <w:rPr/>
       </w:pPr>
-      <w:bookmarkStart w:id="182" w:name="__RefHeading___Toc11636_1805670434"/>
+      <w:bookmarkStart w:id="182" w:name="__RefHeading___Toc11664_3742996938"/>
       <w:bookmarkStart w:id="183" w:name="what-the-spec-permits"/>
       <w:bookmarkEnd w:id="182"/>
       <w:r>
@@ -37822,7 +37822,7 @@
         <w:spacing w:before="280" w:after="80"/>
         <w:rPr/>
       </w:pPr>
-      <w:bookmarkStart w:id="184" w:name="__RefHeading___Toc11638_1805670434"/>
+      <w:bookmarkStart w:id="184" w:name="__RefHeading___Toc11666_3742996938"/>
       <w:bookmarkStart w:id="185" w:name="the-rotation-model"/>
       <w:bookmarkEnd w:id="184"/>
       <w:r>
@@ -38013,7 +38013,7 @@
         <w:spacing w:before="280" w:after="80"/>
         <w:rPr/>
       </w:pPr>
-      <w:bookmarkStart w:id="186" w:name="__RefHeading___Toc11640_1805670434"/>
+      <w:bookmarkStart w:id="186" w:name="__RefHeading___Toc11668_3742996938"/>
       <w:bookmarkStart w:id="187" w:name="crossing-a-word-the-retry-cycle"/>
       <w:bookmarkEnd w:id="186"/>
       <w:r>
@@ -38188,7 +38188,7 @@
         <w:spacing w:before="200" w:after="80"/>
         <w:rPr/>
       </w:pPr>
-      <w:bookmarkStart w:id="188" w:name="__RefHeading___Toc11642_1805670434"/>
+      <w:bookmarkStart w:id="188" w:name="__RefHeading___Toc11670_3742996938"/>
       <w:bookmarkStart w:id="189" w:name="Xbdc63cc80f90eea2c7239fcc86c06ae4e795e09"/>
       <w:bookmarkStart w:id="190" w:name="_Fig_3_The_two_beat_cross_w"/>
       <w:bookmarkEnd w:id="188"/>
@@ -38221,7 +38221,7 @@
         <w:rPr/>
         <w:drawing>
           <wp:inline distT="0" distB="0" distL="0" distR="0">
-            <wp:extent cx="5334000" cy="2011680"/>
+            <wp:extent cx="5334000" cy="2177415"/>
             <wp:effectExtent l="0" t="0" r="0" b="0"/>
             <wp:docPr id="3" name="Image3" descr="Cross-word misaligned access timing: two beats, one retirement"/>
             <wp:cNvGraphicFramePr>
@@ -38245,7 +38245,7 @@
                   <pic:spPr bwMode="auto">
                     <a:xfrm>
                       <a:off x="0" y="0"/>
-                      <a:ext cx="5334000" cy="2011680"/>
+                      <a:ext cx="5334000" cy="2177415"/>
                     </a:xfrm>
                     <a:prstGeom prst="rect">
                       <a:avLst/>
@@ -38277,7 +38277,7 @@
         <w:rPr>
           <w:sz w:val="20"/>
         </w:rPr>
-        <w:t xml:space="preserve">The retry is visible on exactly four pins plus RVFI: </w:t>
+        <w:t xml:space="preserve">The retry is visible on the memory pins and RVFI: </w:t>
       </w:r>
       <w:r>
         <w:rPr>
@@ -38303,7 +38303,20 @@
         <w:rPr>
           <w:sz w:val="20"/>
         </w:rPr>
-        <w:t xml:space="preserve"> stays high across both beats, the PC freezes, and </w:t>
+        <w:t xml:space="preserve"> (and </w:t>
+      </w:r>
+      <w:r>
+        <w:rPr>
+          <w:rStyle w:val="VerbatimChar"/>
+          <w:sz w:val="20"/>
+        </w:rPr>
+        <w:t>dmem_we</w:t>
+      </w:r>
+      <w:r>
+        <w:rPr>
+          <w:sz w:val="20"/>
+        </w:rPr>
+        <w:t xml:space="preserve"> for stores) stays high across both beats, the PC freezes for the retry cycle, and </w:t>
       </w:r>
       <w:r>
         <w:rPr>
@@ -38330,7 +38343,7 @@
         <w:spacing w:before="280" w:after="80"/>
         <w:rPr/>
       </w:pPr>
-      <w:bookmarkStart w:id="191" w:name="__RefHeading___Toc11644_1805670434"/>
+      <w:bookmarkStart w:id="191" w:name="__RefHeading___Toc11672_3742996938"/>
       <w:bookmarkStart w:id="192" w:name="X347c44fbdb672fdae6188e927988a7f2e2f3cd3"/>
       <w:bookmarkEnd w:id="191"/>
       <w:r>
@@ -38544,7 +38557,7 @@
         <w:spacing w:before="280" w:after="80"/>
         <w:rPr/>
       </w:pPr>
-      <w:bookmarkStart w:id="193" w:name="__RefHeading___Toc11646_1805670434"/>
+      <w:bookmarkStart w:id="193" w:name="__RefHeading___Toc11674_3742996938"/>
       <w:bookmarkStart w:id="194" w:name="why-not-trap"/>
       <w:bookmarkEnd w:id="193"/>
       <w:r>
@@ -38649,7 +38662,7 @@
         <w:spacing w:before="360" w:after="120"/>
         <w:rPr/>
       </w:pPr>
-      <w:bookmarkStart w:id="195" w:name="__RefHeading___Toc11648_1805670434"/>
+      <w:bookmarkStart w:id="195" w:name="__RefHeading___Toc11676_3742996938"/>
       <w:bookmarkStart w:id="196" w:name="ialign-and-the-misaligned-target-halt"/>
       <w:bookmarkEnd w:id="195"/>
       <w:r>
@@ -38680,7 +38693,7 @@
         <w:spacing w:before="280" w:after="80"/>
         <w:rPr/>
       </w:pPr>
-      <w:bookmarkStart w:id="197" w:name="__RefHeading___Toc11650_1805670434"/>
+      <w:bookmarkStart w:id="197" w:name="__RefHeading___Toc11678_3742996938"/>
       <w:bookmarkStart w:id="198" w:name="the-rule"/>
       <w:bookmarkEnd w:id="197"/>
       <w:r>
@@ -38765,7 +38778,7 @@
         <w:spacing w:before="280" w:after="80"/>
         <w:rPr/>
       </w:pPr>
-      <w:bookmarkStart w:id="199" w:name="__RefHeading___Toc11652_1805670434"/>
+      <w:bookmarkStart w:id="199" w:name="__RefHeading___Toc11680_3742996938"/>
       <w:bookmarkStart w:id="200" w:name="why-decode-cannot-catch-it"/>
       <w:bookmarkEnd w:id="199"/>
       <w:r>
@@ -38918,7 +38931,7 @@
         <w:spacing w:before="280" w:after="80"/>
         <w:rPr/>
       </w:pPr>
-      <w:bookmarkStart w:id="201" w:name="__RefHeading___Toc11654_1805670434"/>
+      <w:bookmarkStart w:id="201" w:name="__RefHeading___Toc11682_3742996938"/>
       <w:bookmarkStart w:id="202" w:name="the-writeback-subtlety"/>
       <w:bookmarkEnd w:id="201"/>
       <w:r>
@@ -39080,7 +39093,7 @@
         <w:spacing w:before="280" w:after="80"/>
         <w:rPr/>
       </w:pPr>
-      <w:bookmarkStart w:id="203" w:name="__RefHeading___Toc11656_1805670434"/>
+      <w:bookmarkStart w:id="203" w:name="__RefHeading___Toc11684_3742996938"/>
       <w:bookmarkStart w:id="204" w:name="the-four-halt-causes-in-context"/>
       <w:bookmarkEnd w:id="203"/>
       <w:r>
@@ -39816,7 +39829,7 @@
         <w:spacing w:before="280" w:after="80"/>
         <w:rPr/>
       </w:pPr>
-      <w:bookmarkStart w:id="207" w:name="__RefHeading___Toc11658_1805670434"/>
+      <w:bookmarkStart w:id="207" w:name="__RefHeading___Toc11686_3742996938"/>
       <w:bookmarkStart w:id="208" w:name="the-fence_i-connection"/>
       <w:bookmarkEnd w:id="207"/>
       <w:r>
@@ -39961,7 +39974,7 @@
         <w:spacing w:before="360" w:after="120"/>
         <w:rPr/>
       </w:pPr>
-      <w:bookmarkStart w:id="209" w:name="__RefHeading___Toc11660_1805670434"/>
+      <w:bookmarkStart w:id="209" w:name="__RefHeading___Toc11688_3742996938"/>
       <w:bookmarkStart w:id="210" w:name="testbench-and-golden-model"/>
       <w:bookmarkEnd w:id="209"/>
       <w:r>
@@ -39992,7 +40005,7 @@
         <w:spacing w:before="280" w:after="80"/>
         <w:rPr/>
       </w:pPr>
-      <w:bookmarkStart w:id="211" w:name="__RefHeading___Toc11662_1805670434"/>
+      <w:bookmarkStart w:id="211" w:name="__RefHeading___Toc11690_3742996938"/>
       <w:bookmarkStart w:id="212" w:name="the-harness"/>
       <w:bookmarkEnd w:id="211"/>
       <w:r>
@@ -40322,7 +40335,7 @@
         <w:spacing w:before="280" w:after="80"/>
         <w:rPr/>
       </w:pPr>
-      <w:bookmarkStart w:id="213" w:name="__RefHeading___Toc11664_1805670434"/>
+      <w:bookmarkStart w:id="213" w:name="__RefHeading___Toc11692_3742996938"/>
       <w:bookmarkStart w:id="214" w:name="the-golden-interpreter"/>
       <w:bookmarkEnd w:id="213"/>
       <w:r>
@@ -40360,7 +40373,7 @@
         <w:rPr>
           <w:sz w:val="20"/>
         </w:rPr>
-        <w:t xml:space="preserve"> is a ~90-line Python model of RV32I that emits the same RVFI beat format as the core — one record per retired instruction, none for anything that doesn’t retire, plus the halt state. Its memory model mirrors the core’s conventions exactly: word-based, rotated-strobe stores, architectural two-word misaligned loads/stores, the CSR stub’s zero writeback, MRET fall-through, FENCE NOPs, and the cause-3 halt with the misaligned target on </w:t>
+        <w:t xml:space="preserve"> is a 476-line Python model of RV32I that emits the same RVFI beat format as the core — one record per retired instruction, none for anything that doesn’t retire, plus the halt state. Its memory model mirrors the core’s conventions exactly: word-based, rotated-strobe stores, architectural two-word misaligned loads/stores, the CSR stub’s zero writeback, MRET fall-through, FENCE NOPs, and the cause-3 halt with the misaligned target on </w:t>
       </w:r>
       <w:r>
         <w:rPr>
@@ -40399,7 +40412,7 @@
         <w:spacing w:before="280" w:after="80"/>
         <w:rPr/>
       </w:pPr>
-      <w:bookmarkStart w:id="216" w:name="__RefHeading___Toc11666_1805670434"/>
+      <w:bookmarkStart w:id="216" w:name="__RefHeading___Toc11694_3742996938"/>
       <w:bookmarkStart w:id="217" w:name="programs-and-the-hex-pipeline"/>
       <w:bookmarkEnd w:id="216"/>
       <w:r>
@@ -40593,7 +40606,7 @@
         <w:spacing w:before="280" w:after="80"/>
         <w:rPr/>
       </w:pPr>
-      <w:bookmarkStart w:id="218" w:name="__RefHeading___Toc11668_1805670434"/>
+      <w:bookmarkStart w:id="218" w:name="__RefHeading___Toc11696_3742996938"/>
       <w:bookmarkStart w:id="219" w:name="the-run-grammar"/>
       <w:bookmarkEnd w:id="218"/>
       <w:r>
@@ -40768,7 +40781,7 @@
         <w:spacing w:before="360" w:after="120"/>
         <w:rPr/>
       </w:pPr>
-      <w:bookmarkStart w:id="220" w:name="__RefHeading___Toc11670_1805670434"/>
+      <w:bookmarkStart w:id="220" w:name="__RefHeading___Toc11698_3742996938"/>
       <w:bookmarkStart w:id="221" w:name="the-rv32ui-battery"/>
       <w:bookmarkEnd w:id="220"/>
       <w:r>
@@ -40799,7 +40812,7 @@
         <w:spacing w:before="280" w:after="80"/>
         <w:rPr/>
       </w:pPr>
-      <w:bookmarkStart w:id="222" w:name="__RefHeading___Toc11672_1805670434"/>
+      <w:bookmarkStart w:id="222" w:name="__RefHeading___Toc11700_3742996938"/>
       <w:bookmarkStart w:id="223" w:name="what-the-battery-is"/>
       <w:bookmarkEnd w:id="222"/>
       <w:r>
@@ -41679,7 +41692,7 @@
                 <w:szCs w:val="24"/>
                 <w:lang w:val="en-US" w:eastAsia="en-US" w:bidi="ar-SA"/>
               </w:rPr>
-              <w:t>5107</w:t>
+              <w:t>5100</w:t>
             </w:r>
           </w:p>
         </w:tc>
@@ -46438,7 +46451,7 @@
         <w:spacing w:before="280" w:after="80"/>
         <w:rPr/>
       </w:pPr>
-      <w:bookmarkStart w:id="226" w:name="__RefHeading___Toc11674_1805670434"/>
+      <w:bookmarkStart w:id="226" w:name="__RefHeading___Toc11702_3742996938"/>
       <w:bookmarkStart w:id="227" w:name="the-verdict-protocol"/>
       <w:bookmarkEnd w:id="226"/>
       <w:r>
@@ -46646,7 +46659,7 @@
         <w:spacing w:before="280" w:after="80"/>
         <w:rPr/>
       </w:pPr>
-      <w:bookmarkStart w:id="229" w:name="__RefHeading___Toc11676_1805670434"/>
+      <w:bookmarkStart w:id="229" w:name="__RefHeading___Toc11704_3742996938"/>
       <w:bookmarkStart w:id="230" w:name="what-the-battery-proves-and-its-seam"/>
       <w:bookmarkEnd w:id="229"/>
       <w:r>
@@ -46745,7 +46758,7 @@
         <w:spacing w:before="360" w:after="120"/>
         <w:rPr/>
       </w:pPr>
-      <w:bookmarkStart w:id="231" w:name="__RefHeading___Toc11678_1805670434"/>
+      <w:bookmarkStart w:id="231" w:name="__RefHeading___Toc11706_3742996938"/>
       <w:bookmarkStart w:id="232" w:name="spike-lockstep"/>
       <w:bookmarkEnd w:id="231"/>
       <w:r>
@@ -46776,7 +46789,7 @@
         <w:spacing w:before="280" w:after="80"/>
         <w:rPr/>
       </w:pPr>
-      <w:bookmarkStart w:id="233" w:name="__RefHeading___Toc11680_1805670434"/>
+      <w:bookmarkStart w:id="233" w:name="__RefHeading___Toc11708_3742996938"/>
       <w:bookmarkStart w:id="234" w:name="what-lockstep-adds"/>
       <w:bookmarkEnd w:id="233"/>
       <w:r>
@@ -46821,7 +46834,7 @@
         <w:spacing w:before="280" w:after="80"/>
         <w:rPr/>
       </w:pPr>
-      <w:bookmarkStart w:id="236" w:name="__RefHeading___Toc11682_1805670434"/>
+      <w:bookmarkStart w:id="236" w:name="__RefHeading___Toc11710_3742996938"/>
       <w:bookmarkStart w:id="237" w:name="the-mechanics"/>
       <w:bookmarkEnd w:id="236"/>
       <w:r>
@@ -47086,7 +47099,7 @@
         <w:spacing w:before="280" w:after="80"/>
         <w:rPr/>
       </w:pPr>
-      <w:bookmarkStart w:id="238" w:name="__RefHeading___Toc11684_1805670434"/>
+      <w:bookmarkStart w:id="238" w:name="__RefHeading___Toc11712_3742996938"/>
       <w:bookmarkStart w:id="239" w:name="the-misaligned-build-note"/>
       <w:bookmarkEnd w:id="238"/>
       <w:r>
@@ -47236,7 +47249,7 @@
         <w:spacing w:before="280" w:after="80"/>
         <w:rPr/>
       </w:pPr>
-      <w:bookmarkStart w:id="240" w:name="__RefHeading___Toc11686_1805670434"/>
+      <w:bookmarkStart w:id="240" w:name="__RefHeading___Toc11714_3742996938"/>
       <w:bookmarkStart w:id="241" w:name="the-mnstatus-divergence"/>
       <w:bookmarkEnd w:id="240"/>
       <w:r>
@@ -47368,7 +47381,7 @@
         <w:spacing w:before="360" w:after="120"/>
         <w:rPr/>
       </w:pPr>
-      <w:bookmarkStart w:id="242" w:name="__RefHeading___Toc11688_1805670434"/>
+      <w:bookmarkStart w:id="242" w:name="__RefHeading___Toc11716_3742996938"/>
       <w:bookmarkStart w:id="243" w:name="the-riscv-formal-flow"/>
       <w:bookmarkEnd w:id="242"/>
       <w:r>
@@ -47399,7 +47412,7 @@
         <w:spacing w:before="280" w:after="80"/>
         <w:rPr/>
       </w:pPr>
-      <w:bookmarkStart w:id="244" w:name="__RefHeading___Toc11690_1805670434"/>
+      <w:bookmarkStart w:id="244" w:name="__RefHeading___Toc11718_3742996938"/>
       <w:bookmarkStart w:id="245" w:name="what-it-is"/>
       <w:bookmarkEnd w:id="244"/>
       <w:r>
@@ -47471,7 +47484,7 @@
         <w:spacing w:before="280" w:after="80"/>
         <w:rPr/>
       </w:pPr>
-      <w:bookmarkStart w:id="246" w:name="__RefHeading___Toc11692_1805670434"/>
+      <w:bookmarkStart w:id="246" w:name="__RefHeading___Toc11720_3742996938"/>
       <w:bookmarkStart w:id="247" w:name="kestrels-setup"/>
       <w:bookmarkEnd w:id="246"/>
       <w:r>
@@ -47721,7 +47734,7 @@
         <w:spacing w:before="280" w:after="80"/>
         <w:rPr/>
       </w:pPr>
-      <w:bookmarkStart w:id="248" w:name="__RefHeading___Toc11694_1805670434"/>
+      <w:bookmarkStart w:id="248" w:name="__RefHeading___Toc11722_3742996938"/>
       <w:bookmarkStart w:id="249" w:name="the-checks-and-depths"/>
       <w:bookmarkEnd w:id="248"/>
       <w:r>
@@ -47921,7 +47934,7 @@
         <w:spacing w:before="280" w:after="80"/>
         <w:rPr/>
       </w:pPr>
-      <w:bookmarkStart w:id="250" w:name="__RefHeading___Toc11696_1805670434"/>
+      <w:bookmarkStart w:id="250" w:name="__RefHeading___Toc11724_3742996938"/>
       <w:bookmarkStart w:id="251" w:name="the-flows-three-honest-workarounds"/>
       <w:bookmarkEnd w:id="250"/>
       <w:r>
@@ -48117,7 +48130,7 @@
         <w:spacing w:before="280" w:after="80"/>
         <w:rPr/>
       </w:pPr>
-      <w:bookmarkStart w:id="252" w:name="__RefHeading___Toc11698_1805670434"/>
+      <w:bookmarkStart w:id="252" w:name="__RefHeading___Toc11726_3742996938"/>
       <w:bookmarkStart w:id="253" w:name="results"/>
       <w:bookmarkEnd w:id="252"/>
       <w:r>
@@ -48148,7 +48161,7 @@
         <w:rPr>
           <w:sz w:val="20"/>
         </w:rPr>
-        <w:t xml:space="preserve">The first clean build proved the flow end to end and returned 34/42 passing — the eight failures all counterexamples of one genuine core bug, told in the next section. After the fix, a clean rebuild reports </w:t>
+        <w:t xml:space="preserve">The first clean build proved the flow end to end and returned 34/42 passing — the eight failures all counterexamples of one genuine core bug, told in the next section. After the fix, a full rebuild reports </w:t>
       </w:r>
       <w:r>
         <w:rPr>
@@ -48162,7 +48175,7 @@
         <w:rPr>
           <w:sz w:val="20"/>
         </w:rPr>
-        <w:t xml:space="preserve"> (z3/smtbmc), reproduced identically across three full runs including one from </w:t>
+        <w:t xml:space="preserve"> (z3/smtbmc) — and the pre-fix 34/42 failure had itself reproduced identically across three full runs including one from </w:t>
       </w:r>
       <w:r>
         <w:rPr>
@@ -48175,7 +48188,7 @@
         <w:rPr>
           <w:sz w:val="20"/>
         </w:rPr>
-        <w:t>:</w:t>
+        <w:t>, so the green verdict is stable state, not a lucky run:</w:t>
       </w:r>
     </w:p>
     <w:p>
@@ -48337,7 +48350,7 @@
         <w:spacing w:before="360" w:after="120"/>
         <w:rPr/>
       </w:pPr>
-      <w:bookmarkStart w:id="254" w:name="__RefHeading___Toc11700_1805670434"/>
+      <w:bookmarkStart w:id="254" w:name="__RefHeading___Toc11728_3742996938"/>
       <w:bookmarkStart w:id="255" w:name="Xa884b52a21c5dec89af9e39857f3d9c4798cadf"/>
       <w:bookmarkEnd w:id="254"/>
       <w:r>
@@ -48380,7 +48393,7 @@
         <w:spacing w:before="280" w:after="80"/>
         <w:rPr/>
       </w:pPr>
-      <w:bookmarkStart w:id="256" w:name="__RefHeading___Toc11702_1805670434"/>
+      <w:bookmarkStart w:id="256" w:name="__RefHeading___Toc11730_3742996938"/>
       <w:bookmarkStart w:id="257" w:name="the-failure"/>
       <w:bookmarkEnd w:id="256"/>
       <w:r>
@@ -48568,16 +48581,26 @@
         <w:rPr>
           <w:rStyle w:val="VerbatimChar"/>
         </w:rPr>
-        <w:t>0x98001DE3</w:t>
-      </w:r>
-      <w:r>
-        <w:rPr/>
-        <w:t xml:space="preserve"> — opcode </w:t>
+        <w:t>0x980001E3</w:t>
+      </w:r>
+      <w:r>
+        <w:rPr/>
+        <w:t xml:space="preserve"> — a </w:t>
       </w:r>
       <w:r>
         <w:rPr>
           <w:rStyle w:val="VerbatimChar"/>
         </w:rPr>
+        <w:t>beq x0, x0</w:t>
+      </w:r>
+      <w:r>
+        <w:rPr/>
+        <w:t xml:space="preserve"> (opcode </w:t>
+      </w:r>
+      <w:r>
+        <w:rPr>
+          <w:rStyle w:val="VerbatimChar"/>
+        </w:rPr>
         <w:t>1100011</w:t>
       </w:r>
       <w:r>
@@ -48592,7 +48615,57 @@
       </w:r>
       <w:r>
         <w:rPr/>
-        <w:t>: a BEQ.</w:t>
+        <w:t xml:space="preserve">), taken by construction, whose B-immediate targets </w:t>
+      </w:r>
+      <w:r>
+        <w:rPr>
+          <w:rStyle w:val="VerbatimChar"/>
+        </w:rPr>
+        <w:t>0xFFFFF996</w:t>
+      </w:r>
+      <w:r>
+        <w:rPr/>
+        <w:t xml:space="preserve">: an address with </w:t>
+      </w:r>
+      <w:r>
+        <w:rPr>
+          <w:rStyle w:val="VerbatimChar"/>
+        </w:rPr>
+        <w:t>next_pc[1:0] = 2</w:t>
+      </w:r>
+      <w:r>
+        <w:rPr/>
+        <w:t xml:space="preserve">. (The sibling checks carry their own stimuli — </w:t>
+      </w:r>
+      <w:r>
+        <w:rPr>
+          <w:rStyle w:val="VerbatimChar"/>
+        </w:rPr>
+        <w:t>insn_bne_ch0</w:t>
+      </w:r>
+      <w:r>
+        <w:rPr/>
+        <w:t xml:space="preserve">’s trace, for instance, retires </w:t>
+      </w:r>
+      <w:r>
+        <w:rPr>
+          <w:rStyle w:val="VerbatimChar"/>
+        </w:rPr>
+        <w:t>0x80121163</w:t>
+      </w:r>
+      <w:r>
+        <w:rPr/>
+        <w:t xml:space="preserve">, a taken </w:t>
+      </w:r>
+      <w:r>
+        <w:rPr>
+          <w:rStyle w:val="VerbatimChar"/>
+        </w:rPr>
+        <w:t>bne</w:t>
+      </w:r>
+      <w:r>
+        <w:rPr/>
+        <w:t xml:space="preserve"> to another misaligned target.)</w:t>
       </w:r>
     </w:p>
     <w:p>
@@ -48728,7 +48801,7 @@
         <w:spacing w:before="280" w:after="80"/>
         <w:rPr/>
       </w:pPr>
-      <w:bookmarkStart w:id="258" w:name="__RefHeading___Toc11704_1805670434"/>
+      <w:bookmarkStart w:id="258" w:name="__RefHeading___Toc11732_3742996938"/>
       <w:bookmarkStart w:id="259" w:name="why-the-battery-missed-it"/>
       <w:bookmarkEnd w:id="258"/>
       <w:r>
@@ -48799,7 +48872,7 @@
         <w:spacing w:before="280" w:after="80"/>
         <w:rPr/>
       </w:pPr>
-      <w:bookmarkStart w:id="260" w:name="__RefHeading___Toc11706_1805670434"/>
+      <w:bookmarkStart w:id="260" w:name="__RefHeading___Toc11734_3742996938"/>
       <w:bookmarkStart w:id="261" w:name="the-fix"/>
       <w:bookmarkEnd w:id="260"/>
       <w:r>
@@ -49012,7 +49085,7 @@
         <w:spacing w:before="280" w:after="80"/>
         <w:rPr/>
       </w:pPr>
-      <w:bookmarkStart w:id="262" w:name="__RefHeading___Toc11708_1805670434"/>
+      <w:bookmarkStart w:id="262" w:name="__RefHeading___Toc11736_3742996938"/>
       <w:bookmarkStart w:id="263" w:name="aftermath"/>
       <w:bookmarkEnd w:id="262"/>
       <w:r>
@@ -49084,7 +49157,7 @@
         <w:spacing w:before="280" w:after="80"/>
         <w:rPr/>
       </w:pPr>
-      <w:bookmarkStart w:id="264" w:name="__RefHeading___Toc11710_1805670434"/>
+      <w:bookmarkStart w:id="264" w:name="__RefHeading___Toc11738_3742996938"/>
       <w:bookmarkStart w:id="265" w:name="the-lesson-stated-once"/>
       <w:bookmarkEnd w:id="264"/>
       <w:r>
@@ -49183,7 +49256,7 @@
         <w:spacing w:before="360" w:after="120"/>
         <w:rPr/>
       </w:pPr>
-      <w:bookmarkStart w:id="266" w:name="__RefHeading___Toc11712_1805670434"/>
+      <w:bookmarkStart w:id="266" w:name="__RefHeading___Toc11740_3742996938"/>
       <w:bookmarkStart w:id="267" w:name="what-kestrel-costs"/>
       <w:bookmarkEnd w:id="266"/>
       <w:r>
@@ -49214,7 +49287,7 @@
         <w:spacing w:before="280" w:after="80"/>
         <w:rPr/>
       </w:pPr>
-      <w:bookmarkStart w:id="268" w:name="__RefHeading___Toc11714_1805670434"/>
+      <w:bookmarkStart w:id="268" w:name="__RefHeading___Toc11742_3742996938"/>
       <w:bookmarkStart w:id="269" w:name="cpi-1-honestly-stated"/>
       <w:bookmarkEnd w:id="268"/>
       <w:r>
@@ -49272,7 +49345,7 @@
         <w:spacing w:before="280" w:after="80"/>
         <w:rPr/>
       </w:pPr>
-      <w:bookmarkStart w:id="270" w:name="__RefHeading___Toc11716_1805670434"/>
+      <w:bookmarkStart w:id="270" w:name="__RefHeading___Toc11744_3742996938"/>
       <w:bookmarkStart w:id="271" w:name="the-critical-path-is-the-whole-machine"/>
       <w:bookmarkEnd w:id="270"/>
       <w:r>
@@ -49474,7 +49547,7 @@
         <w:spacing w:before="280" w:after="80"/>
         <w:rPr/>
       </w:pPr>
-      <w:bookmarkStart w:id="272" w:name="__RefHeading___Toc11718_1805670434"/>
+      <w:bookmarkStart w:id="272" w:name="__RefHeading___Toc11746_3742996938"/>
       <w:bookmarkStart w:id="273" w:name="X5c3c3ba7498b6d5b5e43fb637719a3860e34843"/>
       <w:bookmarkEnd w:id="272"/>
       <w:r>
@@ -50018,7 +50091,7 @@
         <w:spacing w:before="280" w:after="80"/>
         <w:rPr/>
       </w:pPr>
-      <w:bookmarkStart w:id="276" w:name="__RefHeading___Toc11720_1805670434"/>
+      <w:bookmarkStart w:id="276" w:name="__RefHeading___Toc11748_3742996938"/>
       <w:bookmarkStart w:id="277" w:name="what-would-have-to-give"/>
       <w:bookmarkEnd w:id="276"/>
       <w:r>
@@ -50097,7 +50170,7 @@
         <w:spacing w:before="360" w:after="120"/>
         <w:rPr/>
       </w:pPr>
-      <w:bookmarkStart w:id="278" w:name="__RefHeading___Toc11722_1805670434"/>
+      <w:bookmarkStart w:id="278" w:name="__RefHeading___Toc11750_3742996938"/>
       <w:bookmarkStart w:id="279" w:name="the-next-rung-merlin"/>
       <w:bookmarkEnd w:id="278"/>
       <w:r>
@@ -50128,7 +50201,7 @@
         <w:spacing w:before="280" w:after="80"/>
         <w:rPr/>
       </w:pPr>
-      <w:bookmarkStart w:id="280" w:name="__RefHeading___Toc11724_1805670434"/>
+      <w:bookmarkStart w:id="280" w:name="__RefHeading___Toc11752_3742996938"/>
       <w:bookmarkStart w:id="281" w:name="the-five-stage-answer"/>
       <w:bookmarkEnd w:id="280"/>
       <w:r>
@@ -50168,7 +50241,7 @@
         <w:spacing w:before="200" w:after="80"/>
         <w:rPr/>
       </w:pPr>
-      <w:bookmarkStart w:id="282" w:name="__RefHeading___Toc11726_1805670434"/>
+      <w:bookmarkStart w:id="282" w:name="__RefHeading___Toc11754_3742996938"/>
       <w:bookmarkStart w:id="283" w:name="X49ae4f70be0f9a553c6a3ca823420fb49c88e54"/>
       <w:bookmarkStart w:id="284" w:name="_Fig_4_kestrel_s_cycle__cut"/>
       <w:bookmarkEnd w:id="282"/>
@@ -50299,7 +50372,7 @@
         <w:spacing w:before="280" w:after="80"/>
         <w:rPr/>
       </w:pPr>
-      <w:bookmarkStart w:id="285" w:name="__RefHeading___Toc11728_1805670434"/>
+      <w:bookmarkStart w:id="285" w:name="__RefHeading___Toc11756_3742996938"/>
       <w:bookmarkStart w:id="286" w:name="what-appears-when-the-cycle-is-cut"/>
       <w:bookmarkEnd w:id="285"/>
       <w:r>
@@ -50448,7 +50521,7 @@
         <w:spacing w:before="280" w:after="80"/>
         <w:rPr/>
       </w:pPr>
-      <w:bookmarkStart w:id="287" w:name="__RefHeading___Toc11730_1805670434"/>
+      <w:bookmarkStart w:id="287" w:name="__RefHeading___Toc11758_3742996938"/>
       <w:bookmarkStart w:id="288" w:name="what-carries-over-unchanged"/>
       <w:bookmarkEnd w:id="287"/>
       <w:r>
@@ -50493,7 +50566,7 @@
         <w:spacing w:before="280" w:after="80"/>
         <w:rPr/>
       </w:pPr>
-      <w:bookmarkStart w:id="290" w:name="__RefHeading___Toc11732_1805670434"/>
+      <w:bookmarkStart w:id="290" w:name="__RefHeading___Toc11760_3742996938"/>
       <w:bookmarkStart w:id="291" w:name="why-the-ladder-stops-here-first"/>
       <w:bookmarkEnd w:id="290"/>
       <w:r>

</xml_diff>